<commit_message>
Correcciones y mejoras de api
</commit_message>
<xml_diff>
--- a/docs/Entrega 2/Microproyecto_Entrega_2.docx
+++ b/docs/Entrega 2/Microproyecto_Entrega_2.docx
@@ -323,8 +323,9 @@
           <w:sz w:val="22"/>
           <w:szCs w:val="22"/>
         </w:rPr>
-        <w:t>Jared Foster Orduz</w:t>
-      </w:r>
+        <w:t xml:space="preserve">Jared Foster </w:t>
+      </w:r>
+      <w:proofErr w:type="gramStart"/>
       <w:r>
         <w:rPr>
           <w:rFonts w:ascii="Bahnschrift" w:hAnsi="Bahnschrift" w:cs="Arial"/>
@@ -332,7 +333,26 @@
           <w:sz w:val="22"/>
           <w:szCs w:val="22"/>
         </w:rPr>
-        <w:t xml:space="preserve">  -  </w:t>
+        <w:t>Orduz</w:t>
+      </w:r>
+      <w:r>
+        <w:rPr>
+          <w:rFonts w:ascii="Bahnschrift" w:hAnsi="Bahnschrift" w:cs="Arial"/>
+          <w:color w:val="5F5E5A"/>
+          <w:sz w:val="22"/>
+          <w:szCs w:val="22"/>
+        </w:rPr>
+        <w:t xml:space="preserve">  -</w:t>
+      </w:r>
+      <w:proofErr w:type="gramEnd"/>
+      <w:r>
+        <w:rPr>
+          <w:rFonts w:ascii="Bahnschrift" w:hAnsi="Bahnschrift" w:cs="Arial"/>
+          <w:color w:val="5F5E5A"/>
+          <w:sz w:val="22"/>
+          <w:szCs w:val="22"/>
+        </w:rPr>
+        <w:t xml:space="preserve">  </w:t>
       </w:r>
       <w:r>
         <w:rPr>
@@ -361,8 +381,9 @@
           <w:sz w:val="22"/>
           <w:szCs w:val="22"/>
         </w:rPr>
-        <w:t>Andres Felipe Florez Garces</w:t>
-      </w:r>
+        <w:t xml:space="preserve">Andres Felipe Florez </w:t>
+      </w:r>
+      <w:proofErr w:type="gramStart"/>
       <w:r>
         <w:rPr>
           <w:rFonts w:ascii="Bahnschrift" w:hAnsi="Bahnschrift" w:cs="Arial"/>
@@ -370,7 +391,26 @@
           <w:sz w:val="22"/>
           <w:szCs w:val="22"/>
         </w:rPr>
-        <w:t xml:space="preserve">  -  </w:t>
+        <w:t>Garces</w:t>
+      </w:r>
+      <w:r>
+        <w:rPr>
+          <w:rFonts w:ascii="Bahnschrift" w:hAnsi="Bahnschrift" w:cs="Arial"/>
+          <w:color w:val="5F5E5A"/>
+          <w:sz w:val="22"/>
+          <w:szCs w:val="22"/>
+        </w:rPr>
+        <w:t xml:space="preserve">  -</w:t>
+      </w:r>
+      <w:proofErr w:type="gramEnd"/>
+      <w:r>
+        <w:rPr>
+          <w:rFonts w:ascii="Bahnschrift" w:hAnsi="Bahnschrift" w:cs="Arial"/>
+          <w:color w:val="5F5E5A"/>
+          <w:sz w:val="22"/>
+          <w:szCs w:val="22"/>
+        </w:rPr>
+        <w:t xml:space="preserve">  </w:t>
       </w:r>
       <w:r>
         <w:rPr>
@@ -470,7 +510,16 @@
           <w:sz w:val="22"/>
           <w:szCs w:val="22"/>
         </w:rPr>
-        <w:t>Agosto de 202</w:t>
+        <w:t>Septiembre</w:t>
+      </w:r>
+      <w:r>
+        <w:rPr>
+          <w:rFonts w:ascii="Bahnschrift" w:hAnsi="Bahnschrift" w:cs="Arial"/>
+          <w:color w:val="5F5E5A"/>
+          <w:sz w:val="22"/>
+          <w:szCs w:val="22"/>
+        </w:rPr>
+        <w:t xml:space="preserve"> de 202</w:t>
       </w:r>
       <w:r>
         <w:rPr>
@@ -631,6 +680,62 @@
           <w:sz w:val="22"/>
           <w:szCs w:val="22"/>
         </w:rPr>
+        <w:t>API (FastAPI</w:t>
+      </w:r>
+      <w:proofErr w:type="gramStart"/>
+      <w:r>
+        <w:rPr>
+          <w:rFonts w:ascii="Bahnschrift" w:hAnsi="Bahnschrift" w:cs="Arial"/>
+          <w:b/>
+          <w:bCs/>
+          <w:sz w:val="22"/>
+          <w:szCs w:val="22"/>
+        </w:rPr>
+        <w:t>) :</w:t>
+      </w:r>
+      <w:proofErr w:type="gramEnd"/>
+      <w:r>
+        <w:rPr>
+          <w:rFonts w:ascii="Bahnschrift" w:hAnsi="Bahnschrift" w:cs="Arial"/>
+          <w:sz w:val="22"/>
+          <w:szCs w:val="22"/>
+        </w:rPr>
+        <w:t xml:space="preserve"> </w:t>
+      </w:r>
+      <w:hyperlink r:id="rId11" w:history="1">
+        <w:r>
+          <w:rPr>
+            <w:rFonts w:ascii="Bahnschrift" w:hAnsi="Bahnschrift" w:cs="Arial"/>
+            <w:color w:val="4472C4" w:themeColor="accent1"/>
+            <w:sz w:val="22"/>
+            <w:szCs w:val="22"/>
+          </w:rPr>
+          <w:t>http://44.204.142.207:8000/docs</w:t>
+        </w:r>
+      </w:hyperlink>
+    </w:p>
+    <w:p>
+      <w:pPr>
+        <w:pStyle w:val="Prrafodelista"/>
+        <w:numPr>
+          <w:ilvl w:val="0"/>
+          <w:numId w:val="3"/>
+        </w:numPr>
+        <w:spacing w:after="120"/>
+        <w:rPr>
+          <w:rFonts w:ascii="Bahnschrift" w:hAnsi="Bahnschrift" w:cs="Arial"/>
+          <w:sz w:val="22"/>
+          <w:szCs w:val="22"/>
+        </w:rPr>
+      </w:pPr>
+      <w:r>
+        <w:rPr>
+          <w:rFonts w:ascii="Bahnschrift" w:hAnsi="Bahnschrift" w:cs="Arial"/>
+          <w:b/>
+          <w:bCs/>
+          <w:sz w:val="22"/>
+          <w:szCs w:val="22"/>
+        </w:rPr>
         <w:t>Tablero — Streamlit (instancia EC2):</w:t>
       </w:r>
       <w:r>
@@ -641,7 +746,7 @@
         </w:rPr>
         <w:t xml:space="preserve"> </w:t>
       </w:r>
-      <w:hyperlink r:id="rId11" w:history="1">
+      <w:hyperlink r:id="rId12" w:history="1">
         <w:r>
           <w:rPr>
             <w:rFonts w:ascii="Bahnschrift" w:hAnsi="Bahnschrift" w:cs="Arial"/>
@@ -762,13 +867,7 @@
         <w:rPr>
           <w:rFonts w:ascii="Bahnschrift" w:hAnsi="Bahnschrift" w:cs="Arial"/>
         </w:rPr>
-        <w:t>A</w:t>
-      </w:r>
-      <w:r>
-        <w:rPr>
-          <w:rFonts w:ascii="Bahnschrift" w:hAnsi="Bahnschrift" w:cs="Arial"/>
-        </w:rPr>
-        <w:t>lcance del proyecto</w:t>
+        <w:t>Alcance del proyecto</w:t>
       </w:r>
     </w:p>
     <w:p>
@@ -804,7 +903,7 @@
         </w:rPr>
         <w:t xml:space="preserve"> </w:t>
       </w:r>
-      <w:hyperlink r:id="rId12" w:history="1">
+      <w:hyperlink r:id="rId13" w:history="1">
         <w:r>
           <w:rPr>
             <w:rStyle w:val="Hipervnculo"/>
@@ -1051,7 +1150,6 @@
           <w:sz w:val="22"/>
           <w:szCs w:val="22"/>
         </w:rPr>
-        <w:lastRenderedPageBreak/>
         <w:t>Cambio respecto a la Entrega 1: de las 21 variables originales se seleccionó un subconjunto final de 11 predictores —HighBP, HighChol, BMI, Smoker, Stroke, HeartDiseaseorAttack, PhysActivity, GenHlth, DiffWalk, Age e Income—, priorizando las variables con mayor correlación (positiva o negativa) con la variable objetivo, y descartando variables redundantes o de bajo aporte, para simplificar el formulario del tablero sin perder poder predictivo. El detalle de esta selección se retoma en la sección 5.1.2.</w:t>
       </w:r>
     </w:p>
@@ -1345,7 +1443,7 @@
                     </pic:cNvPicPr>
                   </pic:nvPicPr>
                   <pic:blipFill>
-                    <a:blip r:embed="rId13"/>
+                    <a:blip r:embed="rId14"/>
                     <a:srcRect/>
                     <a:stretch>
                       <a:fillRect/>
@@ -1386,6 +1484,7 @@
           <w:sz w:val="16"/>
           <w:szCs w:val="16"/>
         </w:rPr>
+        <w:lastRenderedPageBreak/>
         <w:t>Figura 1. Correlación de cada variable con Diabetes_binary. En azul/naranja, las 11 variables seleccionadas como predictoras finales; en gris, las variables descartadas.</w:t>
       </w:r>
     </w:p>
@@ -1625,7 +1724,15 @@
                 <w:sz w:val="19"/>
                 <w:szCs w:val="19"/>
               </w:rPr>
-              <w:t>0.862</w:t>
+              <w:t>0.</w:t>
+            </w:r>
+            <w:r>
+              <w:rPr>
+                <w:rFonts w:ascii="Bahnschrift" w:hAnsi="Bahnschrift"/>
+                <w:sz w:val="19"/>
+                <w:szCs w:val="19"/>
+              </w:rPr>
+              <w:t>861</w:t>
             </w:r>
           </w:p>
         </w:tc>
@@ -1648,7 +1755,15 @@
                 <w:sz w:val="19"/>
                 <w:szCs w:val="19"/>
               </w:rPr>
-              <w:t>0.511</w:t>
+              <w:t>0.</w:t>
+            </w:r>
+            <w:r>
+              <w:rPr>
+                <w:rFonts w:ascii="Bahnschrift" w:hAnsi="Bahnschrift"/>
+                <w:sz w:val="19"/>
+                <w:szCs w:val="19"/>
+              </w:rPr>
+              <w:t>511</w:t>
             </w:r>
           </w:p>
         </w:tc>
@@ -1671,7 +1786,15 @@
                 <w:sz w:val="19"/>
                 <w:szCs w:val="19"/>
               </w:rPr>
-              <w:t>0.148</w:t>
+              <w:t>0.</w:t>
+            </w:r>
+            <w:r>
+              <w:rPr>
+                <w:rFonts w:ascii="Bahnschrift" w:hAnsi="Bahnschrift"/>
+                <w:sz w:val="19"/>
+                <w:szCs w:val="19"/>
+              </w:rPr>
+              <w:t>148</w:t>
             </w:r>
           </w:p>
         </w:tc>
@@ -1694,7 +1817,15 @@
                 <w:sz w:val="19"/>
                 <w:szCs w:val="19"/>
               </w:rPr>
-              <w:t>0.230</w:t>
+              <w:t>0.</w:t>
+            </w:r>
+            <w:r>
+              <w:rPr>
+                <w:rFonts w:ascii="Bahnschrift" w:hAnsi="Bahnschrift"/>
+                <w:sz w:val="19"/>
+                <w:szCs w:val="19"/>
+              </w:rPr>
+              <w:t>229</w:t>
             </w:r>
           </w:p>
         </w:tc>
@@ -1717,7 +1848,15 @@
                 <w:sz w:val="19"/>
                 <w:szCs w:val="19"/>
               </w:rPr>
-              <w:t>0.815</w:t>
+              <w:t>0.8</w:t>
+            </w:r>
+            <w:r>
+              <w:rPr>
+                <w:rFonts w:ascii="Bahnschrift" w:hAnsi="Bahnschrift"/>
+                <w:sz w:val="19"/>
+                <w:szCs w:val="19"/>
+              </w:rPr>
+              <w:t>14</w:t>
             </w:r>
           </w:p>
         </w:tc>
@@ -1766,7 +1905,15 @@
                 <w:sz w:val="19"/>
                 <w:szCs w:val="19"/>
               </w:rPr>
-              <w:t>0.727</w:t>
+              <w:t>0.</w:t>
+            </w:r>
+            <w:r>
+              <w:rPr>
+                <w:rFonts w:ascii="Bahnschrift" w:hAnsi="Bahnschrift"/>
+                <w:sz w:val="19"/>
+                <w:szCs w:val="19"/>
+              </w:rPr>
+              <w:t>726</w:t>
             </w:r>
           </w:p>
         </w:tc>
@@ -1789,7 +1936,15 @@
                 <w:sz w:val="19"/>
                 <w:szCs w:val="19"/>
               </w:rPr>
-              <w:t>0.306</w:t>
+              <w:t>0.</w:t>
+            </w:r>
+            <w:r>
+              <w:rPr>
+                <w:rFonts w:ascii="Bahnschrift" w:hAnsi="Bahnschrift"/>
+                <w:sz w:val="19"/>
+                <w:szCs w:val="19"/>
+              </w:rPr>
+              <w:t>306</w:t>
             </w:r>
           </w:p>
         </w:tc>
@@ -1812,7 +1967,15 @@
                 <w:sz w:val="19"/>
                 <w:szCs w:val="19"/>
               </w:rPr>
-              <w:t>0.757</w:t>
+              <w:t>0.</w:t>
+            </w:r>
+            <w:r>
+              <w:rPr>
+                <w:rFonts w:ascii="Bahnschrift" w:hAnsi="Bahnschrift"/>
+                <w:sz w:val="19"/>
+                <w:szCs w:val="19"/>
+              </w:rPr>
+              <w:t>757</w:t>
             </w:r>
           </w:p>
         </w:tc>
@@ -1835,7 +1998,15 @@
                 <w:sz w:val="19"/>
                 <w:szCs w:val="19"/>
               </w:rPr>
-              <w:t>0.436</w:t>
+              <w:t>0.</w:t>
+            </w:r>
+            <w:r>
+              <w:rPr>
+                <w:rFonts w:ascii="Bahnschrift" w:hAnsi="Bahnschrift"/>
+                <w:sz w:val="19"/>
+                <w:szCs w:val="19"/>
+              </w:rPr>
+              <w:t>435</w:t>
             </w:r>
           </w:p>
         </w:tc>
@@ -1858,7 +2029,15 @@
                 <w:sz w:val="19"/>
                 <w:szCs w:val="19"/>
               </w:rPr>
-              <w:t>0.814</w:t>
+              <w:t>0.8</w:t>
+            </w:r>
+            <w:r>
+              <w:rPr>
+                <w:rFonts w:ascii="Bahnschrift" w:hAnsi="Bahnschrift"/>
+                <w:sz w:val="19"/>
+                <w:szCs w:val="19"/>
+              </w:rPr>
+              <w:t>13</w:t>
             </w:r>
           </w:p>
         </w:tc>
@@ -1904,7 +2083,15 @@
                 <w:sz w:val="19"/>
                 <w:szCs w:val="19"/>
               </w:rPr>
-              <w:t>0.722</w:t>
+              <w:t>0.</w:t>
+            </w:r>
+            <w:r>
+              <w:rPr>
+                <w:rFonts w:ascii="Bahnschrift" w:hAnsi="Bahnschrift"/>
+                <w:sz w:val="19"/>
+                <w:szCs w:val="19"/>
+              </w:rPr>
+              <w:t>721</w:t>
             </w:r>
           </w:p>
         </w:tc>
@@ -1927,7 +2114,7 @@
                 <w:sz w:val="19"/>
                 <w:szCs w:val="19"/>
               </w:rPr>
-              <w:t>0.304</w:t>
+              <w:t>0.303</w:t>
             </w:r>
           </w:p>
         </w:tc>
@@ -1950,7 +2137,7 @@
                 <w:sz w:val="19"/>
                 <w:szCs w:val="19"/>
               </w:rPr>
-              <w:t>0.773</w:t>
+              <w:t>0.772</w:t>
             </w:r>
           </w:p>
         </w:tc>
@@ -1996,7 +2183,15 @@
                 <w:sz w:val="19"/>
                 <w:szCs w:val="19"/>
               </w:rPr>
-              <w:t>0.820</w:t>
+              <w:t>0.81</w:t>
+            </w:r>
+            <w:r>
+              <w:rPr>
+                <w:rFonts w:ascii="Bahnschrift" w:hAnsi="Bahnschrift"/>
+                <w:sz w:val="19"/>
+                <w:szCs w:val="19"/>
+              </w:rPr>
+              <w:t>9</w:t>
             </w:r>
           </w:p>
         </w:tc>
@@ -2045,7 +2240,15 @@
                 <w:sz w:val="19"/>
                 <w:szCs w:val="19"/>
               </w:rPr>
-              <w:t>0.788</w:t>
+              <w:t>0.7</w:t>
+            </w:r>
+            <w:r>
+              <w:rPr>
+                <w:rFonts w:ascii="Bahnschrift" w:hAnsi="Bahnschrift"/>
+                <w:sz w:val="19"/>
+                <w:szCs w:val="19"/>
+              </w:rPr>
+              <w:t>88</w:t>
             </w:r>
           </w:p>
         </w:tc>
@@ -2068,7 +2271,15 @@
                 <w:sz w:val="19"/>
                 <w:szCs w:val="19"/>
               </w:rPr>
-              <w:t>0.352</w:t>
+              <w:t>0.3</w:t>
+            </w:r>
+            <w:r>
+              <w:rPr>
+                <w:rFonts w:ascii="Bahnschrift" w:hAnsi="Bahnschrift"/>
+                <w:sz w:val="19"/>
+                <w:szCs w:val="19"/>
+              </w:rPr>
+              <w:t>52</w:t>
             </w:r>
           </w:p>
         </w:tc>
@@ -2091,7 +2302,15 @@
                 <w:sz w:val="19"/>
                 <w:szCs w:val="19"/>
               </w:rPr>
-              <w:t>0.618</w:t>
+              <w:t>0.</w:t>
+            </w:r>
+            <w:r>
+              <w:rPr>
+                <w:rFonts w:ascii="Bahnschrift" w:hAnsi="Bahnschrift"/>
+                <w:sz w:val="19"/>
+                <w:szCs w:val="19"/>
+              </w:rPr>
+              <w:t>617</w:t>
             </w:r>
           </w:p>
         </w:tc>
@@ -2114,7 +2333,15 @@
                 <w:sz w:val="19"/>
                 <w:szCs w:val="19"/>
               </w:rPr>
-              <w:t>0.449</w:t>
+              <w:t>0.4</w:t>
+            </w:r>
+            <w:r>
+              <w:rPr>
+                <w:rFonts w:ascii="Bahnschrift" w:hAnsi="Bahnschrift"/>
+                <w:sz w:val="19"/>
+                <w:szCs w:val="19"/>
+              </w:rPr>
+              <w:t>48</w:t>
             </w:r>
           </w:p>
         </w:tc>
@@ -2137,7 +2364,15 @@
                 <w:sz w:val="19"/>
                 <w:szCs w:val="19"/>
               </w:rPr>
-              <w:t>0.813</w:t>
+              <w:t>0.81</w:t>
+            </w:r>
+            <w:r>
+              <w:rPr>
+                <w:rFonts w:ascii="Bahnschrift" w:hAnsi="Bahnschrift"/>
+                <w:sz w:val="19"/>
+                <w:szCs w:val="19"/>
+              </w:rPr>
+              <w:t>2</w:t>
             </w:r>
           </w:p>
         </w:tc>
@@ -2175,7 +2410,7 @@
                     </pic:cNvPicPr>
                   </pic:nvPicPr>
                   <pic:blipFill>
-                    <a:blip r:embed="rId14"/>
+                    <a:blip r:embed="rId15"/>
                     <a:srcRect/>
                     <a:stretch>
                       <a:fillRect/>
@@ -2572,7 +2807,25 @@
           <w:sz w:val="22"/>
           <w:szCs w:val="22"/>
         </w:rPr>
-        <w:t>Cada corrida (run) queda registrada con su tipo de modelo (model_type), sus hiperparámetros completos (n_estimators, max_depth, etc., vía model.get_params()), y si se aplicó SMOTE o no (smote=True/False), permitiendo reproducir exactamente cómo se entrenó cada modelo.</w:t>
+        <w:t>Cada corrida (run) queda registrada con su tipo de modelo (model_type), sus hiperparámetros completos (n_estimators, max_depth, etc., vía model.get_</w:t>
+      </w:r>
+      <w:proofErr w:type="gramStart"/>
+      <w:r>
+        <w:rPr>
+          <w:rFonts w:ascii="Bahnschrift" w:hAnsi="Bahnschrift" w:cs="Arial"/>
+          <w:sz w:val="22"/>
+          <w:szCs w:val="22"/>
+        </w:rPr>
+        <w:t>params(</w:t>
+      </w:r>
+      <w:proofErr w:type="gramEnd"/>
+      <w:r>
+        <w:rPr>
+          <w:rFonts w:ascii="Bahnschrift" w:hAnsi="Bahnschrift" w:cs="Arial"/>
+          <w:sz w:val="22"/>
+          <w:szCs w:val="22"/>
+        </w:rPr>
+        <w:t>)), y si se aplicó SMOTE o no (smote=True/False), permitiendo reproducir exactamente cómo se entrenó cada modelo.</w:t>
       </w:r>
     </w:p>
     <w:p>
@@ -2590,77 +2843,6 @@
             <wp:extent cx="3619500" cy="1857375"/>
             <wp:effectExtent l="0" t="0" r="0" b="0"/>
             <wp:docPr id="158290593" name="Imagen 158290593"/>
-            <wp:cNvGraphicFramePr>
-              <a:graphicFrameLocks xmlns:a="http://schemas.openxmlformats.org/drawingml/2006/main" noChangeAspect="1"/>
-            </wp:cNvGraphicFramePr>
-            <a:graphic xmlns:a="http://schemas.openxmlformats.org/drawingml/2006/main">
-              <a:graphicData uri="http://schemas.openxmlformats.org/drawingml/2006/picture">
-                <pic:pic xmlns:pic="http://schemas.openxmlformats.org/drawingml/2006/picture">
-                  <pic:nvPicPr>
-                    <pic:cNvPr id="0" name=""/>
-                    <pic:cNvPicPr>
-                      <a:picLocks noChangeAspect="1" noChangeArrowheads="1"/>
-                    </pic:cNvPicPr>
-                  </pic:nvPicPr>
-                  <pic:blipFill>
-                    <a:blip r:embed="rId15"/>
-                    <a:srcRect/>
-                    <a:stretch>
-                      <a:fillRect/>
-                    </a:stretch>
-                  </pic:blipFill>
-                  <pic:spPr bwMode="auto">
-                    <a:xfrm>
-                      <a:off x="0" y="0"/>
-                      <a:ext cx="3619500" cy="1857375"/>
-                    </a:xfrm>
-                    <a:prstGeom prst="rect">
-                      <a:avLst/>
-                    </a:prstGeom>
-                  </pic:spPr>
-                </pic:pic>
-              </a:graphicData>
-            </a:graphic>
-          </wp:inline>
-        </w:drawing>
-      </w:r>
-    </w:p>
-    <w:p>
-      <w:pPr>
-        <w:spacing w:after="200"/>
-        <w:jc w:val="center"/>
-        <w:rPr>
-          <w:rFonts w:ascii="Bahnschrift" w:hAnsi="Bahnschrift"/>
-          <w:sz w:val="18"/>
-          <w:szCs w:val="18"/>
-        </w:rPr>
-      </w:pPr>
-      <w:r>
-        <w:rPr>
-          <w:rFonts w:ascii="Bahnschrift" w:hAnsi="Bahnschrift"/>
-          <w:i/>
-          <w:iCs/>
-          <w:color w:val="5F5E5A"/>
-          <w:sz w:val="16"/>
-          <w:szCs w:val="16"/>
-        </w:rPr>
-        <w:t>Figura 3. Terminal de la instancia EC2 (usuario ubuntu, IP pública 44.204.142.207 visible en el panel inferior) mostrando el entrenamiento y las métricas de las 4 corridas.</w:t>
-      </w:r>
-    </w:p>
-    <w:p>
-      <w:pPr>
-        <w:spacing w:after="60"/>
-        <w:jc w:val="center"/>
-      </w:pPr>
-      <w:r>
-        <w:rPr>
-          <w:noProof/>
-        </w:rPr>
-        <w:drawing>
-          <wp:inline distT="0" distB="0" distL="0" distR="0" wp14:anchorId="24959A4A" wp14:editId="1A4CC14E">
-            <wp:extent cx="3810000" cy="2057400"/>
-            <wp:effectExtent l="0" t="0" r="0" b="0"/>
-            <wp:docPr id="873797597" name="Imagen 873797597"/>
             <wp:cNvGraphicFramePr>
               <a:graphicFrameLocks xmlns:a="http://schemas.openxmlformats.org/drawingml/2006/main" noChangeAspect="1"/>
             </wp:cNvGraphicFramePr>
@@ -2683,7 +2865,7 @@
                   <pic:spPr bwMode="auto">
                     <a:xfrm>
                       <a:off x="0" y="0"/>
-                      <a:ext cx="3810000" cy="2057400"/>
+                      <a:ext cx="3619500" cy="1857375"/>
                     </a:xfrm>
                     <a:prstGeom prst="rect">
                       <a:avLst/>
@@ -2715,35 +2897,7 @@
           <w:sz w:val="16"/>
           <w:szCs w:val="16"/>
         </w:rPr>
-        <w:t>Figura 4. Interfaz de MLflow accedida desde el navegador con la IP pública de la instancia EC2 (44.204.142.207:5000) en la URL, mostrando las 4 corridas del experimento diabetesrisk.</w:t>
-      </w:r>
-    </w:p>
-    <w:p>
-      <w:pPr>
-        <w:pStyle w:val="Ttulo3"/>
-        <w:spacing w:before="160" w:after="80"/>
-        <w:rPr>
-          <w:rFonts w:ascii="Bahnschrift" w:hAnsi="Bahnschrift"/>
-        </w:rPr>
-      </w:pPr>
-      <w:r>
-        <w:rPr>
-          <w:rFonts w:ascii="Bahnschrift" w:hAnsi="Bahnschrift"/>
-        </w:rPr>
-        <w:t>5.2.2 Selección de características</w:t>
-      </w:r>
-    </w:p>
-    <w:p>
-      <w:pPr>
-        <w:spacing w:after="120"/>
-      </w:pPr>
-      <w:r>
-        <w:rPr>
-          <w:rFonts w:ascii="Bahnschrift" w:hAnsi="Bahnschrift" w:cs="Arial"/>
-          <w:sz w:val="22"/>
-          <w:szCs w:val="22"/>
-        </w:rPr>
-        <w:t>A partir de esta entrega, el listado de variables usadas (features) y su cantidad (n_features) se registran explícitamente como parámetros de cada corrida en MLflow, además de quedar fijos en el código versionado (src/train.py), de modo que cualquier corrida futura sea trazable respecto a qué variables se usaron.</w:t>
+        <w:t>Figura 3. Terminal de la instancia EC2 (usuario ubuntu, IP pública 44.204.142.207 visible en el panel inferior) mostrando el entrenamiento y las métricas de las 4 corridas.</w:t>
       </w:r>
     </w:p>
     <w:p>
@@ -2756,10 +2910,10 @@
           <w:noProof/>
         </w:rPr>
         <w:drawing>
-          <wp:inline distT="0" distB="0" distL="0" distR="0" wp14:anchorId="0DA09E90" wp14:editId="65EFA9E4">
-            <wp:extent cx="4000500" cy="2171700"/>
+          <wp:inline distT="0" distB="0" distL="0" distR="0" wp14:anchorId="24959A4A" wp14:editId="1A4CC14E">
+            <wp:extent cx="3810000" cy="2057400"/>
             <wp:effectExtent l="0" t="0" r="0" b="0"/>
-            <wp:docPr id="1365221702" name="Imagen 1365221702"/>
+            <wp:docPr id="873797597" name="Imagen 873797597"/>
             <wp:cNvGraphicFramePr>
               <a:graphicFrameLocks xmlns:a="http://schemas.openxmlformats.org/drawingml/2006/main" noChangeAspect="1"/>
             </wp:cNvGraphicFramePr>
@@ -2782,6 +2936,105 @@
                   <pic:spPr bwMode="auto">
                     <a:xfrm>
                       <a:off x="0" y="0"/>
+                      <a:ext cx="3810000" cy="2057400"/>
+                    </a:xfrm>
+                    <a:prstGeom prst="rect">
+                      <a:avLst/>
+                    </a:prstGeom>
+                  </pic:spPr>
+                </pic:pic>
+              </a:graphicData>
+            </a:graphic>
+          </wp:inline>
+        </w:drawing>
+      </w:r>
+    </w:p>
+    <w:p>
+      <w:pPr>
+        <w:spacing w:after="200"/>
+        <w:jc w:val="center"/>
+        <w:rPr>
+          <w:rFonts w:ascii="Bahnschrift" w:hAnsi="Bahnschrift"/>
+          <w:sz w:val="18"/>
+          <w:szCs w:val="18"/>
+        </w:rPr>
+      </w:pPr>
+      <w:r>
+        <w:rPr>
+          <w:rFonts w:ascii="Bahnschrift" w:hAnsi="Bahnschrift"/>
+          <w:i/>
+          <w:iCs/>
+          <w:color w:val="5F5E5A"/>
+          <w:sz w:val="16"/>
+          <w:szCs w:val="16"/>
+        </w:rPr>
+        <w:t>Figura 4. Interfaz de MLflow accedida desde el navegador con la IP pública de la instancia EC2 (44.204.142.207:5000) en la URL, mostrando las 4 corridas del experimento diabetesrisk.</w:t>
+      </w:r>
+    </w:p>
+    <w:p>
+      <w:pPr>
+        <w:pStyle w:val="Ttulo3"/>
+        <w:spacing w:before="160" w:after="80"/>
+        <w:rPr>
+          <w:rFonts w:ascii="Bahnschrift" w:hAnsi="Bahnschrift"/>
+        </w:rPr>
+      </w:pPr>
+      <w:r>
+        <w:rPr>
+          <w:rFonts w:ascii="Bahnschrift" w:hAnsi="Bahnschrift"/>
+        </w:rPr>
+        <w:t>5.2.2 Selección de características</w:t>
+      </w:r>
+    </w:p>
+    <w:p>
+      <w:pPr>
+        <w:spacing w:after="120"/>
+      </w:pPr>
+      <w:r>
+        <w:rPr>
+          <w:rFonts w:ascii="Bahnschrift" w:hAnsi="Bahnschrift" w:cs="Arial"/>
+          <w:sz w:val="22"/>
+          <w:szCs w:val="22"/>
+        </w:rPr>
+        <w:t>A partir de esta entrega, el listado de variables usadas (features) y su cantidad (n_features) se registran explícitamente como parámetros de cada corrida en MLflow, además de quedar fijos en el código versionado (src/train.py), de modo que cualquier corrida futura sea trazable respecto a qué variables se usaron.</w:t>
+      </w:r>
+    </w:p>
+    <w:p>
+      <w:pPr>
+        <w:spacing w:after="60"/>
+        <w:jc w:val="center"/>
+      </w:pPr>
+      <w:r>
+        <w:rPr>
+          <w:noProof/>
+        </w:rPr>
+        <w:drawing>
+          <wp:inline distT="0" distB="0" distL="0" distR="0" wp14:anchorId="0DA09E90" wp14:editId="65EFA9E4">
+            <wp:extent cx="4000500" cy="2171700"/>
+            <wp:effectExtent l="0" t="0" r="0" b="0"/>
+            <wp:docPr id="1365221702" name="Imagen 1365221702"/>
+            <wp:cNvGraphicFramePr>
+              <a:graphicFrameLocks xmlns:a="http://schemas.openxmlformats.org/drawingml/2006/main" noChangeAspect="1"/>
+            </wp:cNvGraphicFramePr>
+            <a:graphic xmlns:a="http://schemas.openxmlformats.org/drawingml/2006/main">
+              <a:graphicData uri="http://schemas.openxmlformats.org/drawingml/2006/picture">
+                <pic:pic xmlns:pic="http://schemas.openxmlformats.org/drawingml/2006/picture">
+                  <pic:nvPicPr>
+                    <pic:cNvPr id="0" name=""/>
+                    <pic:cNvPicPr>
+                      <a:picLocks noChangeAspect="1" noChangeArrowheads="1"/>
+                    </pic:cNvPicPr>
+                  </pic:nvPicPr>
+                  <pic:blipFill>
+                    <a:blip r:embed="rId18"/>
+                    <a:srcRect/>
+                    <a:stretch>
+                      <a:fillRect/>
+                    </a:stretch>
+                  </pic:blipFill>
+                  <pic:spPr bwMode="auto">
+                    <a:xfrm>
+                      <a:off x="0" y="0"/>
                       <a:ext cx="4000500" cy="2171700"/>
                     </a:xfrm>
                     <a:prstGeom prst="rect">
@@ -2900,7 +3153,7 @@
                     </pic:cNvPicPr>
                   </pic:nvPicPr>
                   <pic:blipFill>
-                    <a:blip r:embed="rId18"/>
+                    <a:blip r:embed="rId19"/>
                     <a:srcRect/>
                     <a:stretch>
                       <a:fillRect/>
@@ -3531,7 +3784,7 @@
                     </pic:cNvPicPr>
                   </pic:nvPicPr>
                   <pic:blipFill>
-                    <a:blip r:embed="rId19"/>
+                    <a:blip r:embed="rId20"/>
                     <a:srcRect/>
                     <a:stretch>
                       <a:fillRect/>
@@ -3644,570 +3897,6 @@
             <wp:extent cx="3810000" cy="2781300"/>
             <wp:effectExtent l="0" t="0" r="0" b="0"/>
             <wp:docPr id="1286948006" name="Imagen 1286948006"/>
-            <wp:cNvGraphicFramePr>
-              <a:graphicFrameLocks xmlns:a="http://schemas.openxmlformats.org/drawingml/2006/main" noChangeAspect="1"/>
-            </wp:cNvGraphicFramePr>
-            <a:graphic xmlns:a="http://schemas.openxmlformats.org/drawingml/2006/main">
-              <a:graphicData uri="http://schemas.openxmlformats.org/drawingml/2006/picture">
-                <pic:pic xmlns:pic="http://schemas.openxmlformats.org/drawingml/2006/picture">
-                  <pic:nvPicPr>
-                    <pic:cNvPr id="0" name=""/>
-                    <pic:cNvPicPr>
-                      <a:picLocks noChangeAspect="1" noChangeArrowheads="1"/>
-                    </pic:cNvPicPr>
-                  </pic:nvPicPr>
-                  <pic:blipFill>
-                    <a:blip r:embed="rId20"/>
-                    <a:srcRect/>
-                    <a:stretch>
-                      <a:fillRect/>
-                    </a:stretch>
-                  </pic:blipFill>
-                  <pic:spPr bwMode="auto">
-                    <a:xfrm>
-                      <a:off x="0" y="0"/>
-                      <a:ext cx="3810000" cy="2781300"/>
-                    </a:xfrm>
-                    <a:prstGeom prst="rect">
-                      <a:avLst/>
-                    </a:prstGeom>
-                  </pic:spPr>
-                </pic:pic>
-              </a:graphicData>
-            </a:graphic>
-          </wp:inline>
-        </w:drawing>
-      </w:r>
-    </w:p>
-    <w:p>
-      <w:pPr>
-        <w:spacing w:after="200"/>
-        <w:jc w:val="center"/>
-        <w:rPr>
-          <w:rFonts w:ascii="Bahnschrift" w:hAnsi="Bahnschrift"/>
-          <w:sz w:val="18"/>
-          <w:szCs w:val="18"/>
-        </w:rPr>
-      </w:pPr>
-      <w:r>
-        <w:rPr>
-          <w:rFonts w:ascii="Bahnschrift" w:hAnsi="Bahnschrift"/>
-          <w:i/>
-          <w:iCs/>
-          <w:color w:val="5F5E5A"/>
-          <w:sz w:val="16"/>
-          <w:szCs w:val="16"/>
-        </w:rPr>
-        <w:t xml:space="preserve">Figura </w:t>
-      </w:r>
-      <w:r>
-        <w:rPr>
-          <w:rFonts w:ascii="Bahnschrift" w:hAnsi="Bahnschrift"/>
-          <w:i/>
-          <w:iCs/>
-          <w:color w:val="5F5E5A"/>
-          <w:sz w:val="16"/>
-          <w:szCs w:val="16"/>
-        </w:rPr>
-        <w:t>8</w:t>
-      </w:r>
-      <w:r>
-        <w:rPr>
-          <w:rFonts w:ascii="Bahnschrift" w:hAnsi="Bahnschrift"/>
-          <w:i/>
-          <w:iCs/>
-          <w:color w:val="5F5E5A"/>
-          <w:sz w:val="16"/>
-          <w:szCs w:val="16"/>
-        </w:rPr>
-        <w:t>. Importancia de cada variable en el modelo random_forest_balanced, medida como reducción promedio de impureza Gini.</w:t>
-      </w:r>
-    </w:p>
-    <w:p>
-      <w:pPr>
-        <w:pStyle w:val="Ttulo1"/>
-        <w:spacing w:before="240" w:after="120"/>
-        <w:rPr>
-          <w:rFonts w:ascii="Bahnschrift" w:hAnsi="Bahnschrift" w:cs="Arial"/>
-        </w:rPr>
-      </w:pPr>
-      <w:r>
-        <w:rPr>
-          <w:rFonts w:ascii="Bahnschrift" w:hAnsi="Bahnschrift" w:cs="Arial"/>
-        </w:rPr>
-        <w:t>6. Conclusiones de los modelos</w:t>
-      </w:r>
-    </w:p>
-    <w:p>
-      <w:pPr>
-        <w:pStyle w:val="Ttulo2"/>
-        <w:rPr>
-          <w:rFonts w:ascii="Bahnschrift" w:hAnsi="Bahnschrift"/>
-        </w:rPr>
-      </w:pPr>
-    </w:p>
-    <w:p>
-      <w:pPr>
-        <w:pStyle w:val="Prrafodelista"/>
-        <w:numPr>
-          <w:ilvl w:val="0"/>
-          <w:numId w:val="4"/>
-        </w:numPr>
-        <w:spacing w:after="60"/>
-        <w:rPr>
-          <w:rFonts w:ascii="Bahnschrift" w:hAnsi="Bahnschrift" w:cs="Arial"/>
-          <w:sz w:val="22"/>
-          <w:szCs w:val="22"/>
-        </w:rPr>
-      </w:pPr>
-      <w:r>
-        <w:rPr>
-          <w:rFonts w:ascii="Bahnschrift" w:hAnsi="Bahnschrift" w:cs="Arial"/>
-          <w:sz w:val="22"/>
-          <w:szCs w:val="22"/>
-        </w:rPr>
-        <w:lastRenderedPageBreak/>
-        <w:t>El modelo base (sin tratar el desbalance) alcanza una accuracy engañosamente alta (86.2%) pero un recall muy bajo (14.8%): el modelo aprende a predecir casi siempre "sin diabetes", que es la clase mayoritaria. Esto confirma la importancia de no usar accuracy como única métrica en problemas desbalanceados.</w:t>
-      </w:r>
-    </w:p>
-    <w:p>
-      <w:pPr>
-        <w:pStyle w:val="Prrafodelista"/>
-        <w:numPr>
-          <w:ilvl w:val="0"/>
-          <w:numId w:val="4"/>
-        </w:numPr>
-        <w:spacing w:after="60"/>
-        <w:rPr>
-          <w:rFonts w:ascii="Bahnschrift" w:hAnsi="Bahnschrift" w:cs="Arial"/>
-          <w:sz w:val="22"/>
-          <w:szCs w:val="22"/>
-        </w:rPr>
-      </w:pPr>
-      <w:r>
-        <w:rPr>
-          <w:rFonts w:ascii="Bahnschrift" w:hAnsi="Bahnschrift" w:cs="Arial"/>
-          <w:sz w:val="22"/>
-          <w:szCs w:val="22"/>
-        </w:rPr>
-        <w:t>Tanto SMOTE como class_weight='balanced' logran mejoras similares y sustanciales en recall (61.8%-77.3%), a costa de una caída esperada en precision y accuracy. Este es el trade-off correcto para un caso de uso de tamizaje, donde priorizar sensibilidad (no dejar pasar casos de riesgo) es más importante que la precisión exacta.</w:t>
-      </w:r>
-    </w:p>
-    <w:p>
-      <w:pPr>
-        <w:pStyle w:val="Prrafodelista"/>
-        <w:numPr>
-          <w:ilvl w:val="0"/>
-          <w:numId w:val="4"/>
-        </w:numPr>
-        <w:spacing w:after="60"/>
-        <w:rPr>
-          <w:rFonts w:ascii="Bahnschrift" w:hAnsi="Bahnschrift" w:cs="Arial"/>
-          <w:sz w:val="22"/>
-          <w:szCs w:val="22"/>
-        </w:rPr>
-      </w:pPr>
-      <w:r>
-        <w:rPr>
-          <w:rFonts w:ascii="Bahnschrift" w:hAnsi="Bahnschrift" w:cs="Arial"/>
-          <w:sz w:val="22"/>
-          <w:szCs w:val="22"/>
-        </w:rPr>
-        <w:t>El ROC-AUC se mantiene estable entre 0.813 y 0.820 en los 4 modelos, lo que indica que la capacidad de discriminación subyacente del modelo cambia poco; lo que sí cambia notablemente es el punto de operación (umbral) resultante de cada estrategia de balanceo.</w:t>
-      </w:r>
-    </w:p>
-    <w:p>
-      <w:pPr>
-        <w:pStyle w:val="Prrafodelista"/>
-        <w:numPr>
-          <w:ilvl w:val="0"/>
-          <w:numId w:val="4"/>
-        </w:numPr>
-        <w:spacing w:after="60"/>
-        <w:rPr>
-          <w:rFonts w:ascii="Bahnschrift" w:hAnsi="Bahnschrift" w:cs="Arial"/>
-          <w:sz w:val="22"/>
-          <w:szCs w:val="22"/>
-        </w:rPr>
-      </w:pPr>
-      <w:r>
-        <w:rPr>
-          <w:rFonts w:ascii="Bahnschrift" w:hAnsi="Bahnschrift" w:cs="Arial"/>
-          <w:sz w:val="22"/>
-          <w:szCs w:val="22"/>
-        </w:rPr>
-        <w:t>Las variables más influyentes son consistentes con los hallazgos de correlación: salud general percibida (GenHlth), presión arterial alta (HighBP) e IMC (BMI) concentran la mayor parte del poder predictivo.</w:t>
-      </w:r>
-    </w:p>
-    <w:p>
-      <w:pPr>
-        <w:pStyle w:val="Prrafodelista"/>
-        <w:numPr>
-          <w:ilvl w:val="0"/>
-          <w:numId w:val="4"/>
-        </w:numPr>
-        <w:spacing w:after="60"/>
-        <w:rPr>
-          <w:rFonts w:ascii="Bahnschrift" w:hAnsi="Bahnschrift" w:cs="Arial"/>
-          <w:sz w:val="22"/>
-          <w:szCs w:val="22"/>
-        </w:rPr>
-      </w:pPr>
-      <w:r>
-        <w:rPr>
-          <w:rFonts w:ascii="Bahnschrift" w:hAnsi="Bahnschrift" w:cs="Arial"/>
-          <w:b/>
-          <w:bCs/>
-          <w:sz w:val="22"/>
-          <w:szCs w:val="22"/>
-        </w:rPr>
-        <w:t>Próximos pasos:</w:t>
-      </w:r>
-      <w:r>
-        <w:rPr>
-          <w:rFonts w:ascii="Bahnschrift" w:hAnsi="Bahnschrift" w:cs="Arial"/>
-          <w:sz w:val="22"/>
-          <w:szCs w:val="22"/>
-        </w:rPr>
-        <w:t xml:space="preserve"> calibrar el umbral de decisión del modelo seleccionado, probar validación cruzada (en vez de una sola partición train/test) y explorar Gradient Boosting como alternativa adicional antes de empaquetar la versión final del modelo.</w:t>
-      </w:r>
-    </w:p>
-    <w:p>
-      <w:pPr>
-        <w:spacing w:after="120"/>
-        <w:rPr>
-          <w:rFonts w:ascii="Bahnschrift" w:hAnsi="Bahnschrift" w:cs="Arial"/>
-          <w:sz w:val="22"/>
-          <w:szCs w:val="22"/>
-        </w:rPr>
-      </w:pPr>
-    </w:p>
-    <w:p>
-      <w:pPr>
-        <w:pStyle w:val="Ttulo1"/>
-        <w:spacing w:before="240" w:after="120"/>
-        <w:rPr>
-          <w:rFonts w:ascii="Bahnschrift" w:hAnsi="Bahnschrift" w:cs="Arial"/>
-        </w:rPr>
-      </w:pPr>
-      <w:r>
-        <w:rPr>
-          <w:rFonts w:ascii="Bahnschrift" w:hAnsi="Bahnschrift" w:cs="Arial"/>
-        </w:rPr>
-        <w:t>7. Tablero desarrollado</w:t>
-      </w:r>
-    </w:p>
-    <w:p>
-      <w:pPr>
-        <w:pStyle w:val="Ttulo2"/>
-        <w:rPr>
-          <w:rFonts w:ascii="Bahnschrift" w:hAnsi="Bahnschrift"/>
-        </w:rPr>
-      </w:pPr>
-    </w:p>
-    <w:p>
-      <w:pPr>
-        <w:spacing w:after="120"/>
-        <w:rPr>
-          <w:rFonts w:ascii="Bahnschrift" w:hAnsi="Bahnschrift" w:cs="Arial"/>
-          <w:sz w:val="22"/>
-          <w:szCs w:val="22"/>
-        </w:rPr>
-      </w:pPr>
-      <w:r>
-        <w:rPr>
-          <w:rFonts w:ascii="Bahnschrift" w:hAnsi="Bahnschrift" w:cs="Arial"/>
-          <w:sz w:val="22"/>
-          <w:szCs w:val="22"/>
-        </w:rPr>
-        <w:t xml:space="preserve">El tablero es accesible en </w:t>
-      </w:r>
-      <w:r>
-        <w:rPr>
-          <w:rFonts w:ascii="Bahnschrift" w:hAnsi="Bahnschrift" w:cs="Arial"/>
-          <w:color w:val="4472C4" w:themeColor="accent1"/>
-          <w:sz w:val="22"/>
-          <w:szCs w:val="22"/>
-        </w:rPr>
-        <w:t>http://44.204.142.207:8501/</w:t>
-      </w:r>
-    </w:p>
-    <w:p>
-      <w:pPr>
-        <w:pStyle w:val="Ttulo2"/>
-        <w:rPr>
-          <w:rFonts w:ascii="Bahnschrift" w:hAnsi="Bahnschrift"/>
-        </w:rPr>
-      </w:pPr>
-      <w:r>
-        <w:rPr>
-          <w:rFonts w:ascii="Bahnschrift" w:hAnsi="Bahnschrift"/>
-        </w:rPr>
-        <w:t>7.1 Empaquetamiento del modelo</w:t>
-      </w:r>
-    </w:p>
-    <w:p>
-      <w:pPr>
-        <w:pStyle w:val="Ttulo2"/>
-        <w:rPr>
-          <w:rFonts w:ascii="Bahnschrift" w:hAnsi="Bahnschrift"/>
-        </w:rPr>
-      </w:pPr>
-    </w:p>
-    <w:p>
-      <w:pPr>
-        <w:spacing w:after="120"/>
-        <w:rPr>
-          <w:rFonts w:ascii="Bahnschrift" w:hAnsi="Bahnschrift" w:cs="Arial"/>
-          <w:sz w:val="22"/>
-          <w:szCs w:val="22"/>
-        </w:rPr>
-      </w:pPr>
-      <w:r>
-        <w:rPr>
-          <w:rFonts w:ascii="Bahnschrift" w:hAnsi="Bahnschrift" w:cs="Arial"/>
-          <w:sz w:val="22"/>
-          <w:szCs w:val="22"/>
-        </w:rPr>
-        <w:t>Al finalizar el entrenamiento, el script src/train.py selecciona automáticamente el modelo con mejor recall entre las 4 corridas (random_forest_balanced) y lo serializa con joblib en src/model.pkl, junto con el listado de features y el nombre del modelo, en un único artefacto: {model, features, model_name}. Esto permite que el tablero cargue el modelo correcto sin necesidad de conocer de antemano cuál fue el ganador.</w:t>
-      </w:r>
-    </w:p>
-    <w:p>
-      <w:pPr>
-        <w:spacing w:after="120"/>
-        <w:rPr>
-          <w:rFonts w:ascii="Bahnschrift" w:hAnsi="Bahnschrift" w:cs="Arial"/>
-          <w:sz w:val="22"/>
-          <w:szCs w:val="22"/>
-        </w:rPr>
-      </w:pPr>
-      <w:r>
-        <w:rPr>
-          <w:rFonts w:ascii="Bahnschrift" w:hAnsi="Bahnschrift" w:cs="Arial"/>
-          <w:sz w:val="22"/>
-          <w:szCs w:val="22"/>
-        </w:rPr>
-        <w:t>La confirmación de este empaquetamiento es visible en la Figura 3 (línea final: "Modelo guardado en src/model.pkl (modelo seleccionado: random_forest_balanced)").</w:t>
-      </w:r>
-    </w:p>
-    <w:p>
-      <w:pPr>
-        <w:pStyle w:val="Ttulo2"/>
-        <w:rPr>
-          <w:rFonts w:ascii="Bahnschrift" w:hAnsi="Bahnschrift"/>
-        </w:rPr>
-      </w:pPr>
-    </w:p>
-    <w:p>
-      <w:pPr>
-        <w:pStyle w:val="Ttulo2"/>
-        <w:rPr>
-          <w:rFonts w:ascii="Bahnschrift" w:hAnsi="Bahnschrift"/>
-        </w:rPr>
-      </w:pPr>
-      <w:r>
-        <w:rPr>
-          <w:rFonts w:ascii="Bahnschrift" w:hAnsi="Bahnschrift"/>
-        </w:rPr>
-        <w:t>7.2 Implementación del tablero</w:t>
-      </w:r>
-    </w:p>
-    <w:p>
-      <w:pPr>
-        <w:pStyle w:val="Ttulo2"/>
-        <w:rPr>
-          <w:rFonts w:ascii="Bahnschrift" w:hAnsi="Bahnschrift"/>
-        </w:rPr>
-      </w:pPr>
-    </w:p>
-    <w:p>
-      <w:pPr>
-        <w:spacing w:after="120"/>
-        <w:rPr>
-          <w:rFonts w:ascii="Bahnschrift" w:hAnsi="Bahnschrift" w:cs="Arial"/>
-          <w:sz w:val="22"/>
-          <w:szCs w:val="22"/>
-        </w:rPr>
-      </w:pPr>
-      <w:r>
-        <w:rPr>
-          <w:rFonts w:ascii="Bahnschrift" w:hAnsi="Bahnschrift" w:cs="Arial"/>
-          <w:sz w:val="22"/>
-          <w:szCs w:val="22"/>
-        </w:rPr>
-        <w:t>Se desarrolló el tablero en Streamlit siguiendo la maqueta diseñada en la Entrega 1, conectado directamente al modelo empaquetado (src/model.pkl), corriendo en la misma instancia EC2 usada para MLflow.</w:t>
-      </w:r>
-    </w:p>
-    <w:p>
-      <w:pPr>
-        <w:pStyle w:val="Prrafodelista"/>
-        <w:numPr>
-          <w:ilvl w:val="0"/>
-          <w:numId w:val="4"/>
-        </w:numPr>
-        <w:spacing w:after="60"/>
-        <w:rPr>
-          <w:rFonts w:ascii="Bahnschrift" w:hAnsi="Bahnschrift" w:cs="Arial"/>
-          <w:sz w:val="22"/>
-          <w:szCs w:val="22"/>
-        </w:rPr>
-      </w:pPr>
-      <w:r>
-        <w:rPr>
-          <w:rFonts w:ascii="Bahnschrift" w:hAnsi="Bahnschrift" w:cs="Arial"/>
-          <w:b/>
-          <w:bCs/>
-          <w:sz w:val="22"/>
-          <w:szCs w:val="22"/>
-        </w:rPr>
-        <w:t>Formulario de evaluación individual:</w:t>
-      </w:r>
-      <w:r>
-        <w:rPr>
-          <w:rFonts w:ascii="Bahnschrift" w:hAnsi="Bahnschrift" w:cs="Arial"/>
-          <w:sz w:val="22"/>
-          <w:szCs w:val="22"/>
-        </w:rPr>
-        <w:t xml:space="preserve"> recoge las 11 variables usadas por el modelo.</w:t>
-      </w:r>
-    </w:p>
-    <w:p>
-      <w:pPr>
-        <w:pStyle w:val="Prrafodelista"/>
-        <w:numPr>
-          <w:ilvl w:val="0"/>
-          <w:numId w:val="4"/>
-        </w:numPr>
-        <w:spacing w:after="60"/>
-        <w:rPr>
-          <w:rFonts w:ascii="Bahnschrift" w:hAnsi="Bahnschrift" w:cs="Arial"/>
-          <w:sz w:val="22"/>
-          <w:szCs w:val="22"/>
-        </w:rPr>
-      </w:pPr>
-      <w:r>
-        <w:rPr>
-          <w:rFonts w:ascii="Bahnschrift" w:hAnsi="Bahnschrift" w:cs="Arial"/>
-          <w:sz w:val="22"/>
-          <w:szCs w:val="22"/>
-        </w:rPr>
-        <w:t>Predicción en tiempo real: al enviar el formulario, el tablero llama directamente a model.predict_proba() y muestra el porcentaje de riesgo, clasificado en tres niveles (bajo &lt;20%, moderado 20-45%, alto &gt;45%) con su color correspondiente.</w:t>
-      </w:r>
-    </w:p>
-    <w:p>
-      <w:pPr>
-        <w:pStyle w:val="Prrafodelista"/>
-        <w:numPr>
-          <w:ilvl w:val="0"/>
-          <w:numId w:val="4"/>
-        </w:numPr>
-        <w:spacing w:after="60"/>
-        <w:rPr>
-          <w:rFonts w:ascii="Bahnschrift" w:hAnsi="Bahnschrift" w:cs="Arial"/>
-          <w:sz w:val="22"/>
-          <w:szCs w:val="22"/>
-        </w:rPr>
-      </w:pPr>
-      <w:r>
-        <w:rPr>
-          <w:rFonts w:ascii="Bahnschrift" w:hAnsi="Bahnschrift" w:cs="Arial"/>
-          <w:b/>
-          <w:bCs/>
-          <w:sz w:val="22"/>
-          <w:szCs w:val="22"/>
-        </w:rPr>
-        <w:t>Panel de estadísticas descriptivas:</w:t>
-      </w:r>
-      <w:r>
-        <w:rPr>
-          <w:rFonts w:ascii="Bahnschrift" w:hAnsi="Bahnschrift" w:cs="Arial"/>
-          <w:sz w:val="22"/>
-          <w:szCs w:val="22"/>
-        </w:rPr>
-        <w:t xml:space="preserve"> número de registros analizados, prevalencia general, nombre del modelo activo, y dos gráficas de prevalencia por IMC y por grupo de edad, calculadas en vivo sobre el dataset completo.</w:t>
-      </w:r>
-    </w:p>
-    <w:p>
-      <w:pPr>
-        <w:pStyle w:val="Prrafodelista"/>
-        <w:numPr>
-          <w:ilvl w:val="0"/>
-          <w:numId w:val="4"/>
-        </w:numPr>
-        <w:spacing w:after="60"/>
-        <w:rPr>
-          <w:rFonts w:ascii="Bahnschrift" w:hAnsi="Bahnschrift" w:cs="Arial"/>
-          <w:sz w:val="22"/>
-          <w:szCs w:val="22"/>
-        </w:rPr>
-      </w:pPr>
-      <w:r>
-        <w:rPr>
-          <w:rFonts w:ascii="Bahnschrift" w:hAnsi="Bahnschrift" w:cs="Arial"/>
-          <w:b/>
-          <w:bCs/>
-          <w:sz w:val="22"/>
-          <w:szCs w:val="22"/>
-        </w:rPr>
-        <w:lastRenderedPageBreak/>
-        <w:t>Mensaje de responsabilidad:</w:t>
-      </w:r>
-      <w:r>
-        <w:rPr>
-          <w:rFonts w:ascii="Bahnschrift" w:hAnsi="Bahnschrift" w:cs="Arial"/>
-          <w:sz w:val="22"/>
-          <w:szCs w:val="22"/>
-        </w:rPr>
-        <w:t xml:space="preserve"> se aclara que el resultado es una estimación de un prototipo académico, no un diagnóstico médico.</w:t>
-      </w:r>
-    </w:p>
-    <w:p>
-      <w:pPr>
-        <w:pStyle w:val="Prrafodelista"/>
-        <w:numPr>
-          <w:ilvl w:val="0"/>
-          <w:numId w:val="4"/>
-        </w:numPr>
-        <w:spacing w:after="60"/>
-        <w:rPr>
-          <w:rFonts w:ascii="Bahnschrift" w:hAnsi="Bahnschrift" w:cs="Arial"/>
-          <w:sz w:val="22"/>
-          <w:szCs w:val="22"/>
-        </w:rPr>
-      </w:pPr>
-      <w:r>
-        <w:rPr>
-          <w:rFonts w:ascii="Bahnschrift" w:hAnsi="Bahnschrift" w:cs="Arial"/>
-          <w:b/>
-          <w:bCs/>
-          <w:sz w:val="22"/>
-          <w:szCs w:val="22"/>
-        </w:rPr>
-        <w:t>Aislamiento de dependencias:</w:t>
-      </w:r>
-      <w:r>
-        <w:rPr>
-          <w:rFonts w:ascii="Bahnschrift" w:hAnsi="Bahnschrift" w:cs="Arial"/>
-          <w:sz w:val="22"/>
-          <w:szCs w:val="22"/>
-        </w:rPr>
-        <w:t xml:space="preserve"> el tablero corre en un entorno virtual de Python separado del usado para MLflow, porque Streamlit y MLflow requieren versiones incompatibles de la librería protobuf — un ensayo previo a la separación por contenedores Docker que vendrá en semanas siguientes.</w:t>
-      </w:r>
-    </w:p>
-    <w:p>
-      <w:pPr>
-        <w:spacing w:after="60"/>
-        <w:jc w:val="center"/>
-      </w:pPr>
-      <w:r>
-        <w:rPr>
-          <w:noProof/>
-        </w:rPr>
-        <w:drawing>
-          <wp:inline distT="0" distB="0" distL="0" distR="0" wp14:anchorId="25240045" wp14:editId="712B2537">
-            <wp:extent cx="4000500" cy="2162175"/>
-            <wp:effectExtent l="0" t="0" r="0" b="0"/>
-            <wp:docPr id="584399446" name="Imagen 584399446"/>
             <wp:cNvGraphicFramePr>
               <a:graphicFrameLocks xmlns:a="http://schemas.openxmlformats.org/drawingml/2006/main" noChangeAspect="1"/>
             </wp:cNvGraphicFramePr>
@@ -4230,6 +3919,606 @@
                   <pic:spPr bwMode="auto">
                     <a:xfrm>
                       <a:off x="0" y="0"/>
+                      <a:ext cx="3810000" cy="2781300"/>
+                    </a:xfrm>
+                    <a:prstGeom prst="rect">
+                      <a:avLst/>
+                    </a:prstGeom>
+                  </pic:spPr>
+                </pic:pic>
+              </a:graphicData>
+            </a:graphic>
+          </wp:inline>
+        </w:drawing>
+      </w:r>
+    </w:p>
+    <w:p>
+      <w:pPr>
+        <w:spacing w:after="200"/>
+        <w:jc w:val="center"/>
+        <w:rPr>
+          <w:rFonts w:ascii="Bahnschrift" w:hAnsi="Bahnschrift"/>
+          <w:sz w:val="18"/>
+          <w:szCs w:val="18"/>
+        </w:rPr>
+      </w:pPr>
+      <w:r>
+        <w:rPr>
+          <w:rFonts w:ascii="Bahnschrift" w:hAnsi="Bahnschrift"/>
+          <w:i/>
+          <w:iCs/>
+          <w:color w:val="5F5E5A"/>
+          <w:sz w:val="16"/>
+          <w:szCs w:val="16"/>
+        </w:rPr>
+        <w:t xml:space="preserve">Figura </w:t>
+      </w:r>
+      <w:r>
+        <w:rPr>
+          <w:rFonts w:ascii="Bahnschrift" w:hAnsi="Bahnschrift"/>
+          <w:i/>
+          <w:iCs/>
+          <w:color w:val="5F5E5A"/>
+          <w:sz w:val="16"/>
+          <w:szCs w:val="16"/>
+        </w:rPr>
+        <w:t>8</w:t>
+      </w:r>
+      <w:r>
+        <w:rPr>
+          <w:rFonts w:ascii="Bahnschrift" w:hAnsi="Bahnschrift"/>
+          <w:i/>
+          <w:iCs/>
+          <w:color w:val="5F5E5A"/>
+          <w:sz w:val="16"/>
+          <w:szCs w:val="16"/>
+        </w:rPr>
+        <w:t>. Importancia de cada variable en el modelo random_forest_balanced, medida como reducción promedio de impureza Gini.</w:t>
+      </w:r>
+    </w:p>
+    <w:p>
+      <w:pPr>
+        <w:pStyle w:val="Ttulo1"/>
+        <w:spacing w:before="240" w:after="120"/>
+        <w:rPr>
+          <w:rFonts w:ascii="Bahnschrift" w:hAnsi="Bahnschrift" w:cs="Arial"/>
+        </w:rPr>
+      </w:pPr>
+      <w:r>
+        <w:rPr>
+          <w:rFonts w:ascii="Bahnschrift" w:hAnsi="Bahnschrift" w:cs="Arial"/>
+        </w:rPr>
+        <w:t>6. Conclusiones de los modelos</w:t>
+      </w:r>
+    </w:p>
+    <w:p>
+      <w:pPr>
+        <w:pStyle w:val="Ttulo2"/>
+        <w:rPr>
+          <w:rFonts w:ascii="Bahnschrift" w:hAnsi="Bahnschrift"/>
+        </w:rPr>
+      </w:pPr>
+    </w:p>
+    <w:p>
+      <w:pPr>
+        <w:pStyle w:val="Prrafodelista"/>
+        <w:numPr>
+          <w:ilvl w:val="0"/>
+          <w:numId w:val="4"/>
+        </w:numPr>
+        <w:spacing w:after="60"/>
+        <w:rPr>
+          <w:rFonts w:ascii="Bahnschrift" w:hAnsi="Bahnschrift" w:cs="Arial"/>
+          <w:sz w:val="22"/>
+          <w:szCs w:val="22"/>
+        </w:rPr>
+      </w:pPr>
+      <w:r>
+        <w:rPr>
+          <w:rFonts w:ascii="Bahnschrift" w:hAnsi="Bahnschrift" w:cs="Arial"/>
+          <w:sz w:val="22"/>
+          <w:szCs w:val="22"/>
+        </w:rPr>
+        <w:lastRenderedPageBreak/>
+        <w:t>El modelo base (sin tratar el desbalance) alcanza una accuracy engañosamente alta (86.2%) pero un recall muy bajo (14.8%): el modelo aprende a predecir casi siempre "sin diabetes", que es la clase mayoritaria. Esto confirma la importancia de no usar accuracy como única métrica en problemas desbalanceados.</w:t>
+      </w:r>
+    </w:p>
+    <w:p>
+      <w:pPr>
+        <w:pStyle w:val="Prrafodelista"/>
+        <w:numPr>
+          <w:ilvl w:val="0"/>
+          <w:numId w:val="4"/>
+        </w:numPr>
+        <w:spacing w:after="60"/>
+        <w:rPr>
+          <w:rFonts w:ascii="Bahnschrift" w:hAnsi="Bahnschrift" w:cs="Arial"/>
+          <w:sz w:val="22"/>
+          <w:szCs w:val="22"/>
+        </w:rPr>
+      </w:pPr>
+      <w:r>
+        <w:rPr>
+          <w:rFonts w:ascii="Bahnschrift" w:hAnsi="Bahnschrift" w:cs="Arial"/>
+          <w:sz w:val="22"/>
+          <w:szCs w:val="22"/>
+        </w:rPr>
+        <w:t>Tanto SMOTE como class_weight='balanced' logran mejoras similares y sustanciales en recall (61.8%-77.3%), a costa de una caída esperada en precision y accuracy. Este es el trade-off correcto para un caso de uso de tamizaje, donde priorizar sensibilidad (no dejar pasar casos de riesgo) es más importante que la precisión exacta.</w:t>
+      </w:r>
+    </w:p>
+    <w:p>
+      <w:pPr>
+        <w:pStyle w:val="Prrafodelista"/>
+        <w:numPr>
+          <w:ilvl w:val="0"/>
+          <w:numId w:val="4"/>
+        </w:numPr>
+        <w:spacing w:after="60"/>
+        <w:rPr>
+          <w:rFonts w:ascii="Bahnschrift" w:hAnsi="Bahnschrift" w:cs="Arial"/>
+          <w:sz w:val="22"/>
+          <w:szCs w:val="22"/>
+        </w:rPr>
+      </w:pPr>
+      <w:r>
+        <w:rPr>
+          <w:rFonts w:ascii="Bahnschrift" w:hAnsi="Bahnschrift" w:cs="Arial"/>
+          <w:sz w:val="22"/>
+          <w:szCs w:val="22"/>
+        </w:rPr>
+        <w:t>El ROC-AUC se mantiene estable entre 0.813 y 0.820 en los 4 modelos, lo que indica que la capacidad de discriminación subyacente del modelo cambia poco; lo que sí cambia notablemente es el punto de operación (umbral) resultante de cada estrategia de balanceo.</w:t>
+      </w:r>
+    </w:p>
+    <w:p>
+      <w:pPr>
+        <w:pStyle w:val="Prrafodelista"/>
+        <w:numPr>
+          <w:ilvl w:val="0"/>
+          <w:numId w:val="4"/>
+        </w:numPr>
+        <w:spacing w:after="60"/>
+        <w:rPr>
+          <w:rFonts w:ascii="Bahnschrift" w:hAnsi="Bahnschrift" w:cs="Arial"/>
+          <w:sz w:val="22"/>
+          <w:szCs w:val="22"/>
+        </w:rPr>
+      </w:pPr>
+      <w:r>
+        <w:rPr>
+          <w:rFonts w:ascii="Bahnschrift" w:hAnsi="Bahnschrift" w:cs="Arial"/>
+          <w:sz w:val="22"/>
+          <w:szCs w:val="22"/>
+        </w:rPr>
+        <w:t>Las variables más influyentes son consistentes con los hallazgos de correlación: salud general percibida (GenHlth), presión arterial alta (HighBP) e IMC (BMI) concentran la mayor parte del poder predictivo.</w:t>
+      </w:r>
+    </w:p>
+    <w:p>
+      <w:pPr>
+        <w:pStyle w:val="Prrafodelista"/>
+        <w:numPr>
+          <w:ilvl w:val="0"/>
+          <w:numId w:val="4"/>
+        </w:numPr>
+        <w:spacing w:after="60"/>
+        <w:rPr>
+          <w:rFonts w:ascii="Bahnschrift" w:hAnsi="Bahnschrift" w:cs="Arial"/>
+          <w:sz w:val="22"/>
+          <w:szCs w:val="22"/>
+        </w:rPr>
+      </w:pPr>
+      <w:r>
+        <w:rPr>
+          <w:rFonts w:ascii="Bahnschrift" w:hAnsi="Bahnschrift" w:cs="Arial"/>
+          <w:b/>
+          <w:bCs/>
+          <w:sz w:val="22"/>
+          <w:szCs w:val="22"/>
+        </w:rPr>
+        <w:t>Próximos pasos:</w:t>
+      </w:r>
+      <w:r>
+        <w:rPr>
+          <w:rFonts w:ascii="Bahnschrift" w:hAnsi="Bahnschrift" w:cs="Arial"/>
+          <w:sz w:val="22"/>
+          <w:szCs w:val="22"/>
+        </w:rPr>
+        <w:t xml:space="preserve"> calibrar el umbral de decisión del modelo seleccionado, probar validación cruzada (en vez de una sola partición train/test) y explorar Gradient Boosting como alternativa adicional antes de empaquetar la versión final del modelo.</w:t>
+      </w:r>
+    </w:p>
+    <w:p>
+      <w:pPr>
+        <w:spacing w:after="120"/>
+        <w:rPr>
+          <w:rFonts w:ascii="Bahnschrift" w:hAnsi="Bahnschrift" w:cs="Arial"/>
+          <w:sz w:val="22"/>
+          <w:szCs w:val="22"/>
+        </w:rPr>
+      </w:pPr>
+    </w:p>
+    <w:p>
+      <w:pPr>
+        <w:pStyle w:val="Ttulo1"/>
+        <w:spacing w:before="240" w:after="120"/>
+        <w:rPr>
+          <w:rFonts w:ascii="Bahnschrift" w:hAnsi="Bahnschrift" w:cs="Arial"/>
+        </w:rPr>
+      </w:pPr>
+      <w:r>
+        <w:rPr>
+          <w:rFonts w:ascii="Bahnschrift" w:hAnsi="Bahnschrift" w:cs="Arial"/>
+        </w:rPr>
+        <w:t>7. Tablero desarrollado</w:t>
+      </w:r>
+    </w:p>
+    <w:p>
+      <w:pPr>
+        <w:pStyle w:val="Ttulo2"/>
+        <w:rPr>
+          <w:rFonts w:ascii="Bahnschrift" w:hAnsi="Bahnschrift"/>
+        </w:rPr>
+      </w:pPr>
+    </w:p>
+    <w:p>
+      <w:pPr>
+        <w:spacing w:after="120"/>
+        <w:rPr>
+          <w:rFonts w:ascii="Bahnschrift" w:hAnsi="Bahnschrift" w:cs="Arial"/>
+          <w:sz w:val="22"/>
+          <w:szCs w:val="22"/>
+        </w:rPr>
+      </w:pPr>
+      <w:r>
+        <w:rPr>
+          <w:rFonts w:ascii="Bahnschrift" w:hAnsi="Bahnschrift" w:cs="Arial"/>
+          <w:sz w:val="22"/>
+          <w:szCs w:val="22"/>
+        </w:rPr>
+        <w:t xml:space="preserve">El tablero es accesible en </w:t>
+      </w:r>
+      <w:r>
+        <w:rPr>
+          <w:rFonts w:ascii="Bahnschrift" w:hAnsi="Bahnschrift" w:cs="Arial"/>
+          <w:color w:val="4472C4" w:themeColor="accent1"/>
+          <w:sz w:val="22"/>
+          <w:szCs w:val="22"/>
+        </w:rPr>
+        <w:t>http://44.204.142.207:8501/</w:t>
+      </w:r>
+    </w:p>
+    <w:p>
+      <w:pPr>
+        <w:pStyle w:val="Ttulo2"/>
+        <w:rPr>
+          <w:rFonts w:ascii="Bahnschrift" w:hAnsi="Bahnschrift"/>
+        </w:rPr>
+      </w:pPr>
+      <w:r>
+        <w:rPr>
+          <w:rFonts w:ascii="Bahnschrift" w:hAnsi="Bahnschrift"/>
+        </w:rPr>
+        <w:t>7.1 Empaquetamiento del modelo</w:t>
+      </w:r>
+    </w:p>
+    <w:p>
+      <w:pPr>
+        <w:pStyle w:val="Ttulo2"/>
+        <w:rPr>
+          <w:rFonts w:ascii="Bahnschrift" w:hAnsi="Bahnschrift"/>
+        </w:rPr>
+      </w:pPr>
+    </w:p>
+    <w:p>
+      <w:pPr>
+        <w:spacing w:after="120"/>
+        <w:rPr>
+          <w:rFonts w:ascii="Bahnschrift" w:hAnsi="Bahnschrift" w:cs="Arial"/>
+          <w:sz w:val="22"/>
+          <w:szCs w:val="22"/>
+        </w:rPr>
+      </w:pPr>
+      <w:r>
+        <w:rPr>
+          <w:rFonts w:ascii="Bahnschrift" w:hAnsi="Bahnschrift" w:cs="Arial"/>
+          <w:sz w:val="22"/>
+          <w:szCs w:val="22"/>
+        </w:rPr>
+        <w:t>Al finalizar el entrenamiento, el script src/train.py selecciona automáticamente el modelo con mejor recall entre las 4 corridas (random_forest_balanced) y lo serializa con joblib en src/model.pkl, junto con el listado de features y el nombre del modelo, en un único artefacto: {model, features, model_name}. Esto permite que el tablero cargue el modelo correcto sin necesidad de conocer de antemano cuál fue el ganador.</w:t>
+      </w:r>
+    </w:p>
+    <w:p>
+      <w:pPr>
+        <w:spacing w:after="120"/>
+        <w:rPr>
+          <w:rFonts w:ascii="Bahnschrift" w:hAnsi="Bahnschrift" w:cs="Arial"/>
+          <w:sz w:val="22"/>
+          <w:szCs w:val="22"/>
+        </w:rPr>
+      </w:pPr>
+      <w:r>
+        <w:rPr>
+          <w:rFonts w:ascii="Bahnschrift" w:hAnsi="Bahnschrift" w:cs="Arial"/>
+          <w:sz w:val="22"/>
+          <w:szCs w:val="22"/>
+        </w:rPr>
+        <w:t>La confirmación de este empaquetamiento es visible en la Figura 3 (línea final: "Modelo guardado en src/model.pkl (modelo seleccionado: random_forest_balanced)").</w:t>
+      </w:r>
+    </w:p>
+    <w:p>
+      <w:pPr>
+        <w:pStyle w:val="Ttulo2"/>
+        <w:rPr>
+          <w:rFonts w:ascii="Bahnschrift" w:hAnsi="Bahnschrift"/>
+        </w:rPr>
+      </w:pPr>
+    </w:p>
+    <w:p>
+      <w:pPr>
+        <w:pStyle w:val="Ttulo2"/>
+        <w:rPr>
+          <w:rFonts w:ascii="Bahnschrift" w:hAnsi="Bahnschrift"/>
+        </w:rPr>
+      </w:pPr>
+      <w:r>
+        <w:rPr>
+          <w:rFonts w:ascii="Bahnschrift" w:hAnsi="Bahnschrift"/>
+        </w:rPr>
+        <w:t>7.2 Implementación del tablero</w:t>
+      </w:r>
+    </w:p>
+    <w:p>
+      <w:pPr>
+        <w:pStyle w:val="Ttulo2"/>
+        <w:rPr>
+          <w:rFonts w:ascii="Bahnschrift" w:hAnsi="Bahnschrift"/>
+        </w:rPr>
+      </w:pPr>
+    </w:p>
+    <w:p>
+      <w:pPr>
+        <w:spacing w:after="120"/>
+        <w:rPr>
+          <w:rFonts w:ascii="Bahnschrift" w:hAnsi="Bahnschrift" w:cs="Arial"/>
+          <w:sz w:val="22"/>
+          <w:szCs w:val="22"/>
+        </w:rPr>
+      </w:pPr>
+      <w:r>
+        <w:rPr>
+          <w:rFonts w:ascii="Bahnschrift" w:hAnsi="Bahnschrift" w:cs="Arial"/>
+          <w:sz w:val="22"/>
+          <w:szCs w:val="22"/>
+        </w:rPr>
+        <w:t>Se desarrolló el tablero en Streamlit siguiendo la maqueta diseñada en la Entrega 1, conectado directamente al modelo empaquetado (src/model.pkl), corriendo en la misma instancia EC2 usada para MLflow.</w:t>
+      </w:r>
+    </w:p>
+    <w:p>
+      <w:pPr>
+        <w:pStyle w:val="Prrafodelista"/>
+        <w:numPr>
+          <w:ilvl w:val="0"/>
+          <w:numId w:val="4"/>
+        </w:numPr>
+        <w:spacing w:after="60"/>
+        <w:rPr>
+          <w:rFonts w:ascii="Bahnschrift" w:hAnsi="Bahnschrift" w:cs="Arial"/>
+          <w:sz w:val="22"/>
+          <w:szCs w:val="22"/>
+        </w:rPr>
+      </w:pPr>
+      <w:r>
+        <w:rPr>
+          <w:rFonts w:ascii="Bahnschrift" w:hAnsi="Bahnschrift" w:cs="Arial"/>
+          <w:b/>
+          <w:bCs/>
+          <w:sz w:val="22"/>
+          <w:szCs w:val="22"/>
+        </w:rPr>
+        <w:t>Formulario de evaluación individual:</w:t>
+      </w:r>
+      <w:r>
+        <w:rPr>
+          <w:rFonts w:ascii="Bahnschrift" w:hAnsi="Bahnschrift" w:cs="Arial"/>
+          <w:sz w:val="22"/>
+          <w:szCs w:val="22"/>
+        </w:rPr>
+        <w:t xml:space="preserve"> recoge las 11 variables usadas por el modelo.</w:t>
+      </w:r>
+    </w:p>
+    <w:p>
+      <w:pPr>
+        <w:pStyle w:val="Prrafodelista"/>
+        <w:numPr>
+          <w:ilvl w:val="0"/>
+          <w:numId w:val="4"/>
+        </w:numPr>
+        <w:spacing w:after="60"/>
+        <w:rPr>
+          <w:rFonts w:ascii="Bahnschrift" w:hAnsi="Bahnschrift" w:cs="Arial"/>
+          <w:sz w:val="22"/>
+          <w:szCs w:val="22"/>
+        </w:rPr>
+      </w:pPr>
+      <w:r>
+        <w:rPr>
+          <w:rFonts w:ascii="Bahnschrift" w:hAnsi="Bahnschrift" w:cs="Arial"/>
+          <w:sz w:val="22"/>
+          <w:szCs w:val="22"/>
+        </w:rPr>
+        <w:t xml:space="preserve">Predicción en tiempo real: al enviar el formulario, el tablero llama directamente a </w:t>
+      </w:r>
+      <w:proofErr w:type="gramStart"/>
+      <w:r>
+        <w:rPr>
+          <w:rFonts w:ascii="Bahnschrift" w:hAnsi="Bahnschrift" w:cs="Arial"/>
+          <w:sz w:val="22"/>
+          <w:szCs w:val="22"/>
+        </w:rPr>
+        <w:t>model.predict</w:t>
+      </w:r>
+      <w:proofErr w:type="gramEnd"/>
+      <w:r>
+        <w:rPr>
+          <w:rFonts w:ascii="Bahnschrift" w:hAnsi="Bahnschrift" w:cs="Arial"/>
+          <w:sz w:val="22"/>
+          <w:szCs w:val="22"/>
+        </w:rPr>
+        <w:t>_</w:t>
+      </w:r>
+      <w:proofErr w:type="gramStart"/>
+      <w:r>
+        <w:rPr>
+          <w:rFonts w:ascii="Bahnschrift" w:hAnsi="Bahnschrift" w:cs="Arial"/>
+          <w:sz w:val="22"/>
+          <w:szCs w:val="22"/>
+        </w:rPr>
+        <w:t>proba(</w:t>
+      </w:r>
+      <w:proofErr w:type="gramEnd"/>
+      <w:r>
+        <w:rPr>
+          <w:rFonts w:ascii="Bahnschrift" w:hAnsi="Bahnschrift" w:cs="Arial"/>
+          <w:sz w:val="22"/>
+          <w:szCs w:val="22"/>
+        </w:rPr>
+        <w:t>) y muestra el porcentaje de riesgo, clasificado en tres niveles (bajo &lt;20%, moderado 20-45%, alto &gt;45%) con su color correspondiente.</w:t>
+      </w:r>
+    </w:p>
+    <w:p>
+      <w:pPr>
+        <w:pStyle w:val="Prrafodelista"/>
+        <w:numPr>
+          <w:ilvl w:val="0"/>
+          <w:numId w:val="4"/>
+        </w:numPr>
+        <w:spacing w:after="60"/>
+        <w:rPr>
+          <w:rFonts w:ascii="Bahnschrift" w:hAnsi="Bahnschrift" w:cs="Arial"/>
+          <w:sz w:val="22"/>
+          <w:szCs w:val="22"/>
+        </w:rPr>
+      </w:pPr>
+      <w:r>
+        <w:rPr>
+          <w:rFonts w:ascii="Bahnschrift" w:hAnsi="Bahnschrift" w:cs="Arial"/>
+          <w:b/>
+          <w:bCs/>
+          <w:sz w:val="22"/>
+          <w:szCs w:val="22"/>
+        </w:rPr>
+        <w:t>Panel de estadísticas descriptivas:</w:t>
+      </w:r>
+      <w:r>
+        <w:rPr>
+          <w:rFonts w:ascii="Bahnschrift" w:hAnsi="Bahnschrift" w:cs="Arial"/>
+          <w:sz w:val="22"/>
+          <w:szCs w:val="22"/>
+        </w:rPr>
+        <w:t xml:space="preserve"> número de registros analizados, prevalencia general, nombre del modelo activo, y dos gráficas de prevalencia por IMC y por grupo de edad, calculadas en vivo sobre el dataset completo.</w:t>
+      </w:r>
+    </w:p>
+    <w:p>
+      <w:pPr>
+        <w:pStyle w:val="Prrafodelista"/>
+        <w:numPr>
+          <w:ilvl w:val="0"/>
+          <w:numId w:val="4"/>
+        </w:numPr>
+        <w:spacing w:after="60"/>
+        <w:rPr>
+          <w:rFonts w:ascii="Bahnschrift" w:hAnsi="Bahnschrift" w:cs="Arial"/>
+          <w:sz w:val="22"/>
+          <w:szCs w:val="22"/>
+        </w:rPr>
+      </w:pPr>
+      <w:r>
+        <w:rPr>
+          <w:rFonts w:ascii="Bahnschrift" w:hAnsi="Bahnschrift" w:cs="Arial"/>
+          <w:b/>
+          <w:bCs/>
+          <w:sz w:val="22"/>
+          <w:szCs w:val="22"/>
+        </w:rPr>
+        <w:lastRenderedPageBreak/>
+        <w:t>Mensaje de responsabilidad:</w:t>
+      </w:r>
+      <w:r>
+        <w:rPr>
+          <w:rFonts w:ascii="Bahnschrift" w:hAnsi="Bahnschrift" w:cs="Arial"/>
+          <w:sz w:val="22"/>
+          <w:szCs w:val="22"/>
+        </w:rPr>
+        <w:t xml:space="preserve"> se aclara que el resultado es una estimación de un prototipo académico, no un diagnóstico médico.</w:t>
+      </w:r>
+    </w:p>
+    <w:p>
+      <w:pPr>
+        <w:pStyle w:val="Prrafodelista"/>
+        <w:numPr>
+          <w:ilvl w:val="0"/>
+          <w:numId w:val="4"/>
+        </w:numPr>
+        <w:spacing w:after="60"/>
+        <w:rPr>
+          <w:rFonts w:ascii="Bahnschrift" w:hAnsi="Bahnschrift" w:cs="Arial"/>
+          <w:sz w:val="22"/>
+          <w:szCs w:val="22"/>
+        </w:rPr>
+      </w:pPr>
+      <w:r>
+        <w:rPr>
+          <w:rFonts w:ascii="Bahnschrift" w:hAnsi="Bahnschrift" w:cs="Arial"/>
+          <w:b/>
+          <w:bCs/>
+          <w:sz w:val="22"/>
+          <w:szCs w:val="22"/>
+        </w:rPr>
+        <w:t>Aislamiento de dependencias:</w:t>
+      </w:r>
+      <w:r>
+        <w:rPr>
+          <w:rFonts w:ascii="Bahnschrift" w:hAnsi="Bahnschrift" w:cs="Arial"/>
+          <w:sz w:val="22"/>
+          <w:szCs w:val="22"/>
+        </w:rPr>
+        <w:t xml:space="preserve"> el tablero corre en un entorno virtual de Python separado del usado para MLflow, porque Streamlit y MLflow requieren versiones incompatibles de la librería protobuf — un ensayo previo a la separación por contenedores Docker que vendrá en semanas siguientes.</w:t>
+      </w:r>
+    </w:p>
+    <w:p>
+      <w:pPr>
+        <w:spacing w:after="60"/>
+        <w:jc w:val="center"/>
+      </w:pPr>
+      <w:r>
+        <w:rPr>
+          <w:noProof/>
+        </w:rPr>
+        <w:drawing>
+          <wp:inline distT="0" distB="0" distL="0" distR="0" wp14:anchorId="25240045" wp14:editId="712B2537">
+            <wp:extent cx="4000500" cy="2162175"/>
+            <wp:effectExtent l="0" t="0" r="0" b="0"/>
+            <wp:docPr id="584399446" name="Imagen 584399446"/>
+            <wp:cNvGraphicFramePr>
+              <a:graphicFrameLocks xmlns:a="http://schemas.openxmlformats.org/drawingml/2006/main" noChangeAspect="1"/>
+            </wp:cNvGraphicFramePr>
+            <a:graphic xmlns:a="http://schemas.openxmlformats.org/drawingml/2006/main">
+              <a:graphicData uri="http://schemas.openxmlformats.org/drawingml/2006/picture">
+                <pic:pic xmlns:pic="http://schemas.openxmlformats.org/drawingml/2006/picture">
+                  <pic:nvPicPr>
+                    <pic:cNvPr id="0" name=""/>
+                    <pic:cNvPicPr>
+                      <a:picLocks noChangeAspect="1" noChangeArrowheads="1"/>
+                    </pic:cNvPicPr>
+                  </pic:nvPicPr>
+                  <pic:blipFill>
+                    <a:blip r:embed="rId22"/>
+                    <a:srcRect/>
+                    <a:stretch>
+                      <a:fillRect/>
+                    </a:stretch>
+                  </pic:blipFill>
+                  <pic:spPr bwMode="auto">
+                    <a:xfrm>
+                      <a:off x="0" y="0"/>
                       <a:ext cx="4000500" cy="2162175"/>
                     </a:xfrm>
                     <a:prstGeom prst="rect">
@@ -4518,7 +4807,7 @@
         </w:rPr>
         <w:t xml:space="preserve"> </w:t>
       </w:r>
-      <w:hyperlink r:id="rId22" w:history="1">
+      <w:hyperlink r:id="rId23" w:history="1">
         <w:r>
           <w:rPr>
             <w:rFonts w:ascii="Bahnschrift" w:hAnsi="Bahnschrift" w:cs="Arial"/>
@@ -4575,6 +4864,7 @@
           <w:rFonts w:ascii="Bahnschrift" w:hAnsi="Bahnschrift" w:cs="Arial"/>
           <w:sz w:val="22"/>
           <w:szCs w:val="22"/>
+          <w:lang w:val="en-US"/>
         </w:rPr>
       </w:pPr>
       <w:r>
@@ -4584,6 +4874,7 @@
           <w:bCs/>
           <w:sz w:val="22"/>
           <w:szCs w:val="22"/>
+          <w:lang w:val="en-US"/>
         </w:rPr>
         <w:t>Modelo empaquetado:</w:t>
       </w:r>
@@ -4592,6 +4883,7 @@
           <w:rFonts w:ascii="Bahnschrift" w:hAnsi="Bahnschrift" w:cs="Arial"/>
           <w:sz w:val="22"/>
           <w:szCs w:val="22"/>
+          <w:lang w:val="en-US"/>
         </w:rPr>
         <w:t xml:space="preserve"> src/model.pkl (Random Forest, class_weight balanceado)</w:t>
       </w:r>
@@ -4693,25 +4985,6 @@
     </w:p>
     <w:p>
       <w:pPr>
-        <w:pStyle w:val="Ttulo2"/>
-        <w:rPr>
-          <w:rFonts w:ascii="Bahnschrift" w:hAnsi="Bahnschrift"/>
-        </w:rPr>
-      </w:pPr>
-    </w:p>
-    <w:p>
-      <w:pPr>
-        <w:spacing w:after="120"/>
-        <w:jc w:val="both"/>
-        <w:rPr>
-          <w:rFonts w:ascii="Bahnschrift" w:hAnsi="Bahnschrift" w:cs="Arial"/>
-          <w:sz w:val="22"/>
-          <w:szCs w:val="22"/>
-        </w:rPr>
-      </w:pPr>
-    </w:p>
-    <w:p>
-      <w:pPr>
         <w:spacing w:after="120"/>
         <w:jc w:val="both"/>
         <w:rPr>
@@ -4891,7 +5164,7 @@
       </w:pPr>
     </w:p>
     <w:sectPr>
-      <w:headerReference w:type="default" r:id="rId23"/>
+      <w:headerReference w:type="default" r:id="rId24"/>
       <w:pgSz w:w="12240" w:h="15840"/>
       <w:pgMar w:top="1000" w:right="1100" w:bottom="1000" w:left="1100" w:header="708" w:footer="708" w:gutter="0"/>
       <w:cols w:space="720"/>
@@ -5449,15 +5722,6 @@
   </w:num>
   <w:num w:numId="2" w16cid:durableId="1889492085">
     <w:abstractNumId w:val="1"/>
-    <w:lvlOverride w:ilvl="0"/>
-    <w:lvlOverride w:ilvl="1"/>
-    <w:lvlOverride w:ilvl="2"/>
-    <w:lvlOverride w:ilvl="3"/>
-    <w:lvlOverride w:ilvl="4"/>
-    <w:lvlOverride w:ilvl="5"/>
-    <w:lvlOverride w:ilvl="6"/>
-    <w:lvlOverride w:ilvl="7"/>
-    <w:lvlOverride w:ilvl="8"/>
   </w:num>
   <w:num w:numId="3" w16cid:durableId="1256013687">
     <w:abstractNumId w:val="3"/>

</xml_diff>

<commit_message>
Ajuste de version matplotlib
</commit_message>
<xml_diff>
--- a/docs/Entrega 2/Microproyecto_Entrega_2.docx
+++ b/docs/Entrega 2/Microproyecto_Entrega_2.docx
@@ -323,9 +323,8 @@
           <w:sz w:val="22"/>
           <w:szCs w:val="22"/>
         </w:rPr>
-        <w:t xml:space="preserve">Jared Foster </w:t>
-      </w:r>
-      <w:proofErr w:type="gramStart"/>
+        <w:t>Jared Foster Orduz</w:t>
+      </w:r>
       <w:r>
         <w:rPr>
           <w:rFonts w:ascii="Bahnschrift" w:hAnsi="Bahnschrift" w:cs="Arial"/>
@@ -333,26 +332,7 @@
           <w:sz w:val="22"/>
           <w:szCs w:val="22"/>
         </w:rPr>
-        <w:t>Orduz</w:t>
-      </w:r>
-      <w:r>
-        <w:rPr>
-          <w:rFonts w:ascii="Bahnschrift" w:hAnsi="Bahnschrift" w:cs="Arial"/>
-          <w:color w:val="5F5E5A"/>
-          <w:sz w:val="22"/>
-          <w:szCs w:val="22"/>
-        </w:rPr>
-        <w:t xml:space="preserve">  -</w:t>
-      </w:r>
-      <w:proofErr w:type="gramEnd"/>
-      <w:r>
-        <w:rPr>
-          <w:rFonts w:ascii="Bahnschrift" w:hAnsi="Bahnschrift" w:cs="Arial"/>
-          <w:color w:val="5F5E5A"/>
-          <w:sz w:val="22"/>
-          <w:szCs w:val="22"/>
-        </w:rPr>
-        <w:t xml:space="preserve">  </w:t>
+        <w:t xml:space="preserve">  -  </w:t>
       </w:r>
       <w:r>
         <w:rPr>
@@ -381,9 +361,8 @@
           <w:sz w:val="22"/>
           <w:szCs w:val="22"/>
         </w:rPr>
-        <w:t xml:space="preserve">Andres Felipe Florez </w:t>
-      </w:r>
-      <w:proofErr w:type="gramStart"/>
+        <w:t>Andres Felipe Florez Garces</w:t>
+      </w:r>
       <w:r>
         <w:rPr>
           <w:rFonts w:ascii="Bahnschrift" w:hAnsi="Bahnschrift" w:cs="Arial"/>
@@ -391,26 +370,7 @@
           <w:sz w:val="22"/>
           <w:szCs w:val="22"/>
         </w:rPr>
-        <w:t>Garces</w:t>
-      </w:r>
-      <w:r>
-        <w:rPr>
-          <w:rFonts w:ascii="Bahnschrift" w:hAnsi="Bahnschrift" w:cs="Arial"/>
-          <w:color w:val="5F5E5A"/>
-          <w:sz w:val="22"/>
-          <w:szCs w:val="22"/>
-        </w:rPr>
-        <w:t xml:space="preserve">  -</w:t>
-      </w:r>
-      <w:proofErr w:type="gramEnd"/>
-      <w:r>
-        <w:rPr>
-          <w:rFonts w:ascii="Bahnschrift" w:hAnsi="Bahnschrift" w:cs="Arial"/>
-          <w:color w:val="5F5E5A"/>
-          <w:sz w:val="22"/>
-          <w:szCs w:val="22"/>
-        </w:rPr>
-        <w:t xml:space="preserve">  </w:t>
+        <w:t xml:space="preserve">  -  </w:t>
       </w:r>
       <w:r>
         <w:rPr>
@@ -680,20 +640,8 @@
           <w:sz w:val="22"/>
           <w:szCs w:val="22"/>
         </w:rPr>
-        <w:t>API (FastAPI</w:t>
-      </w:r>
-      <w:proofErr w:type="gramStart"/>
-      <w:r>
-        <w:rPr>
-          <w:rFonts w:ascii="Bahnschrift" w:hAnsi="Bahnschrift" w:cs="Arial"/>
-          <w:b/>
-          <w:bCs/>
-          <w:sz w:val="22"/>
-          <w:szCs w:val="22"/>
-        </w:rPr>
-        <w:t>) :</w:t>
-      </w:r>
-      <w:proofErr w:type="gramEnd"/>
+        <w:t>API (FastAPI) :</w:t>
+      </w:r>
       <w:r>
         <w:rPr>
           <w:rFonts w:ascii="Bahnschrift" w:hAnsi="Bahnschrift" w:cs="Arial"/>
@@ -2807,25 +2755,7 @@
           <w:sz w:val="22"/>
           <w:szCs w:val="22"/>
         </w:rPr>
-        <w:t>Cada corrida (run) queda registrada con su tipo de modelo (model_type), sus hiperparámetros completos (n_estimators, max_depth, etc., vía model.get_</w:t>
-      </w:r>
-      <w:proofErr w:type="gramStart"/>
-      <w:r>
-        <w:rPr>
-          <w:rFonts w:ascii="Bahnschrift" w:hAnsi="Bahnschrift" w:cs="Arial"/>
-          <w:sz w:val="22"/>
-          <w:szCs w:val="22"/>
-        </w:rPr>
-        <w:t>params(</w:t>
-      </w:r>
-      <w:proofErr w:type="gramEnd"/>
-      <w:r>
-        <w:rPr>
-          <w:rFonts w:ascii="Bahnschrift" w:hAnsi="Bahnschrift" w:cs="Arial"/>
-          <w:sz w:val="22"/>
-          <w:szCs w:val="22"/>
-        </w:rPr>
-        <w:t>)), y si se aplicó SMOTE o no (smote=True/False), permitiendo reproducir exactamente cómo se entrenó cada modelo.</w:t>
+        <w:t>Cada corrida (run) queda registrada con su tipo de modelo (model_type), sus hiperparámetros completos (n_estimators, max_depth, etc., vía model.get_params()), y si se aplicó SMOTE o no (smote=True/False), permitiendo reproducir exactamente cómo se entrenó cada modelo.</w:t>
       </w:r>
     </w:p>
     <w:p>
@@ -2839,9 +2769,9 @@
         </w:rPr>
         <w:lastRenderedPageBreak/>
         <w:drawing>
-          <wp:inline distT="0" distB="0" distL="0" distR="0" wp14:anchorId="3B3741B3" wp14:editId="51E04A77">
-            <wp:extent cx="3619500" cy="1857375"/>
-            <wp:effectExtent l="0" t="0" r="0" b="0"/>
+          <wp:inline distT="0" distB="0" distL="0" distR="0" wp14:anchorId="3B3741B3" wp14:editId="2EA5B9DE">
+            <wp:extent cx="3858218" cy="1979875"/>
+            <wp:effectExtent l="0" t="0" r="0" b="1905"/>
             <wp:docPr id="158290593" name="Imagen 158290593"/>
             <wp:cNvGraphicFramePr>
               <a:graphicFrameLocks xmlns:a="http://schemas.openxmlformats.org/drawingml/2006/main" noChangeAspect="1"/>
@@ -2865,7 +2795,7 @@
                   <pic:spPr bwMode="auto">
                     <a:xfrm>
                       <a:off x="0" y="0"/>
-                      <a:ext cx="3619500" cy="1857375"/>
+                      <a:ext cx="3863004" cy="1982331"/>
                     </a:xfrm>
                     <a:prstGeom prst="rect">
                       <a:avLst/>
@@ -2906,14 +2836,11 @@
         <w:jc w:val="center"/>
       </w:pPr>
       <w:r>
-        <w:rPr>
-          <w:noProof/>
-        </w:rPr>
         <w:drawing>
-          <wp:inline distT="0" distB="0" distL="0" distR="0" wp14:anchorId="24959A4A" wp14:editId="1A4CC14E">
-            <wp:extent cx="3810000" cy="2057400"/>
+          <wp:inline distT="0" distB="0" distL="0" distR="0" wp14:anchorId="1118BDAD" wp14:editId="0DEC0DC0">
+            <wp:extent cx="3967701" cy="2155758"/>
             <wp:effectExtent l="0" t="0" r="0" b="0"/>
-            <wp:docPr id="873797597" name="Imagen 873797597"/>
+            <wp:docPr id="647727562" name="Imagen 1"/>
             <wp:cNvGraphicFramePr>
               <a:graphicFrameLocks xmlns:a="http://schemas.openxmlformats.org/drawingml/2006/main" noChangeAspect="1"/>
             </wp:cNvGraphicFramePr>
@@ -2921,22 +2848,19 @@
               <a:graphicData uri="http://schemas.openxmlformats.org/drawingml/2006/picture">
                 <pic:pic xmlns:pic="http://schemas.openxmlformats.org/drawingml/2006/picture">
                   <pic:nvPicPr>
-                    <pic:cNvPr id="0" name=""/>
-                    <pic:cNvPicPr>
-                      <a:picLocks noChangeAspect="1" noChangeArrowheads="1"/>
-                    </pic:cNvPicPr>
+                    <pic:cNvPr id="647727562" name=""/>
+                    <pic:cNvPicPr/>
                   </pic:nvPicPr>
                   <pic:blipFill>
                     <a:blip r:embed="rId17"/>
-                    <a:srcRect/>
                     <a:stretch>
                       <a:fillRect/>
                     </a:stretch>
                   </pic:blipFill>
-                  <pic:spPr bwMode="auto">
+                  <pic:spPr>
                     <a:xfrm>
                       <a:off x="0" y="0"/>
-                      <a:ext cx="3810000" cy="2057400"/>
+                      <a:ext cx="3990518" cy="2168155"/>
                     </a:xfrm>
                     <a:prstGeom prst="rect">
                       <a:avLst/>
@@ -3005,14 +2929,11 @@
         <w:jc w:val="center"/>
       </w:pPr>
       <w:r>
-        <w:rPr>
-          <w:noProof/>
-        </w:rPr>
         <w:drawing>
-          <wp:inline distT="0" distB="0" distL="0" distR="0" wp14:anchorId="0DA09E90" wp14:editId="65EFA9E4">
-            <wp:extent cx="4000500" cy="2171700"/>
-            <wp:effectExtent l="0" t="0" r="0" b="0"/>
-            <wp:docPr id="1365221702" name="Imagen 1365221702"/>
+          <wp:inline distT="0" distB="0" distL="0" distR="0" wp14:anchorId="0CCF4D0F" wp14:editId="6B97FD0B">
+            <wp:extent cx="3896139" cy="2107563"/>
+            <wp:effectExtent l="0" t="0" r="0" b="7620"/>
+            <wp:docPr id="1218424250" name="Imagen 1"/>
             <wp:cNvGraphicFramePr>
               <a:graphicFrameLocks xmlns:a="http://schemas.openxmlformats.org/drawingml/2006/main" noChangeAspect="1"/>
             </wp:cNvGraphicFramePr>
@@ -3020,22 +2941,19 @@
               <a:graphicData uri="http://schemas.openxmlformats.org/drawingml/2006/picture">
                 <pic:pic xmlns:pic="http://schemas.openxmlformats.org/drawingml/2006/picture">
                   <pic:nvPicPr>
-                    <pic:cNvPr id="0" name=""/>
-                    <pic:cNvPicPr>
-                      <a:picLocks noChangeAspect="1" noChangeArrowheads="1"/>
-                    </pic:cNvPicPr>
+                    <pic:cNvPr id="1218424250" name=""/>
+                    <pic:cNvPicPr/>
                   </pic:nvPicPr>
                   <pic:blipFill>
                     <a:blip r:embed="rId18"/>
-                    <a:srcRect/>
                     <a:stretch>
                       <a:fillRect/>
                     </a:stretch>
                   </pic:blipFill>
-                  <pic:spPr bwMode="auto">
+                  <pic:spPr>
                     <a:xfrm>
                       <a:off x="0" y="0"/>
-                      <a:ext cx="4000500" cy="2171700"/>
+                      <a:ext cx="3906350" cy="2113087"/>
                     </a:xfrm>
                     <a:prstGeom prst="rect">
                       <a:avLst/>
@@ -3067,6 +2985,7 @@
           <w:sz w:val="16"/>
           <w:szCs w:val="16"/>
         </w:rPr>
+        <w:lastRenderedPageBreak/>
         <w:t xml:space="preserve">Figura </w:t>
       </w:r>
       <w:r>
@@ -3104,7 +3023,6 @@
         <w:rPr>
           <w:rFonts w:ascii="Bahnschrift" w:hAnsi="Bahnschrift"/>
         </w:rPr>
-        <w:lastRenderedPageBreak/>
         <w:t>5.2.3 Evaluación de los modelos</w:t>
       </w:r>
     </w:p>
@@ -3132,14 +3050,11 @@
         <w:jc w:val="center"/>
       </w:pPr>
       <w:r>
-        <w:rPr>
-          <w:noProof/>
-        </w:rPr>
         <w:drawing>
-          <wp:inline distT="0" distB="0" distL="0" distR="0" wp14:anchorId="365576C8" wp14:editId="07BAA02A">
-            <wp:extent cx="4000500" cy="2162175"/>
+          <wp:inline distT="0" distB="0" distL="0" distR="0" wp14:anchorId="77159270" wp14:editId="4CEA5B9A">
+            <wp:extent cx="4121354" cy="2234316"/>
             <wp:effectExtent l="0" t="0" r="0" b="0"/>
-            <wp:docPr id="515002252" name="Imagen 515002252"/>
+            <wp:docPr id="1168552434" name="Imagen 1"/>
             <wp:cNvGraphicFramePr>
               <a:graphicFrameLocks xmlns:a="http://schemas.openxmlformats.org/drawingml/2006/main" noChangeAspect="1"/>
             </wp:cNvGraphicFramePr>
@@ -3147,22 +3062,19 @@
               <a:graphicData uri="http://schemas.openxmlformats.org/drawingml/2006/picture">
                 <pic:pic xmlns:pic="http://schemas.openxmlformats.org/drawingml/2006/picture">
                   <pic:nvPicPr>
-                    <pic:cNvPr id="0" name=""/>
-                    <pic:cNvPicPr>
-                      <a:picLocks noChangeAspect="1" noChangeArrowheads="1"/>
-                    </pic:cNvPicPr>
+                    <pic:cNvPr id="1168552434" name=""/>
+                    <pic:cNvPicPr/>
                   </pic:nvPicPr>
                   <pic:blipFill>
                     <a:blip r:embed="rId19"/>
-                    <a:srcRect/>
                     <a:stretch>
                       <a:fillRect/>
                     </a:stretch>
                   </pic:blipFill>
-                  <pic:spPr bwMode="auto">
+                  <pic:spPr>
                     <a:xfrm>
                       <a:off x="0" y="0"/>
-                      <a:ext cx="4000500" cy="2162175"/>
+                      <a:ext cx="4135567" cy="2242021"/>
                     </a:xfrm>
                     <a:prstGeom prst="rect">
                       <a:avLst/>
@@ -4344,43 +4256,7 @@
           <w:sz w:val="22"/>
           <w:szCs w:val="22"/>
         </w:rPr>
-        <w:t xml:space="preserve">Predicción en tiempo real: al enviar el formulario, el tablero llama directamente a </w:t>
-      </w:r>
-      <w:proofErr w:type="gramStart"/>
-      <w:r>
-        <w:rPr>
-          <w:rFonts w:ascii="Bahnschrift" w:hAnsi="Bahnschrift" w:cs="Arial"/>
-          <w:sz w:val="22"/>
-          <w:szCs w:val="22"/>
-        </w:rPr>
-        <w:t>model.predict</w:t>
-      </w:r>
-      <w:proofErr w:type="gramEnd"/>
-      <w:r>
-        <w:rPr>
-          <w:rFonts w:ascii="Bahnschrift" w:hAnsi="Bahnschrift" w:cs="Arial"/>
-          <w:sz w:val="22"/>
-          <w:szCs w:val="22"/>
-        </w:rPr>
-        <w:t>_</w:t>
-      </w:r>
-      <w:proofErr w:type="gramStart"/>
-      <w:r>
-        <w:rPr>
-          <w:rFonts w:ascii="Bahnschrift" w:hAnsi="Bahnschrift" w:cs="Arial"/>
-          <w:sz w:val="22"/>
-          <w:szCs w:val="22"/>
-        </w:rPr>
-        <w:t>proba(</w:t>
-      </w:r>
-      <w:proofErr w:type="gramEnd"/>
-      <w:r>
-        <w:rPr>
-          <w:rFonts w:ascii="Bahnschrift" w:hAnsi="Bahnschrift" w:cs="Arial"/>
-          <w:sz w:val="22"/>
-          <w:szCs w:val="22"/>
-        </w:rPr>
-        <w:t>) y muestra el porcentaje de riesgo, clasificado en tres niveles (bajo &lt;20%, moderado 20-45%, alto &gt;45%) con su color correspondiente.</w:t>
+        <w:t>Predicción en tiempo real: al enviar el formulario, el tablero llama directamente a model.predict_proba() y muestra el porcentaje de riesgo, clasificado en tres niveles (bajo &lt;20%, moderado 20-45%, alto &gt;45%) con su color correspondiente.</w:t>
       </w:r>
     </w:p>
     <w:p>
@@ -6215,6 +6091,7 @@
   <w:style w:type="character" w:default="1" w:styleId="Fuentedeprrafopredeter">
     <w:name w:val="Default Paragraph Font"/>
     <w:uiPriority w:val="1"/>
+    <w:semiHidden/>
     <w:unhideWhenUsed/>
   </w:style>
   <w:style w:type="table" w:default="1" w:styleId="Tablanormal">

</xml_diff>